<commit_message>
fix(be): change the mime type of all system templates
</commit_message>
<xml_diff>
--- a/document-merge-service/kt_bern/templatefiles/de-bestaetigung-waermeerzeugerersatz.docx
+++ b/document-merge-service/kt_bern/templatefiles/de-bestaetigung-waermeerzeugerersatz.docx
@@ -1,31 +1,24 @@
 
 <file path=word/document.xml><?xml version="1.0" encoding="utf-8"?>
-<w:document xmlns:o="urn:schemas-microsoft-com:office:office" xmlns:r="http://schemas.openxmlformats.org/officeDocument/2006/relationships" xmlns:v="urn:schemas-microsoft-com:vml" xmlns:w="http://schemas.openxmlformats.org/wordprocessingml/2006/main" xmlns:w10="urn:schemas-microsoft-com:office:word" xmlns:wp="http://schemas.openxmlformats.org/drawingml/2006/wordprocessingDrawing" xmlns:wps="http://schemas.microsoft.com/office/word/2010/wordprocessingShape" xmlns:wpg="http://schemas.microsoft.com/office/word/2010/wordprocessingGroup" xmlns:mc="http://schemas.openxmlformats.org/markup-compatibility/2006" xmlns:wp14="http://schemas.microsoft.com/office/word/2010/wordprocessingDrawing" xmlns:w14="http://schemas.microsoft.com/office/word/2010/wordml" xmlns:w15="http://schemas.microsoft.com/office/word/2012/wordml" mc:Ignorable="w14 wp14 w15">
+<w:document xmlns:wpc="http://schemas.microsoft.com/office/word/2010/wordprocessingCanvas" xmlns:cx="http://schemas.microsoft.com/office/drawing/2014/chartex" xmlns:cx1="http://schemas.microsoft.com/office/drawing/2015/9/8/chartex" xmlns:cx2="http://schemas.microsoft.com/office/drawing/2015/10/21/chartex" xmlns:cx3="http://schemas.microsoft.com/office/drawing/2016/5/9/chartex" xmlns:cx4="http://schemas.microsoft.com/office/drawing/2016/5/10/chartex" xmlns:cx5="http://schemas.microsoft.com/office/drawing/2016/5/11/chartex" xmlns:cx6="http://schemas.microsoft.com/office/drawing/2016/5/12/chartex" xmlns:cx7="http://schemas.microsoft.com/office/drawing/2016/5/13/chartex" xmlns:cx8="http://schemas.microsoft.com/office/drawing/2016/5/14/chartex" xmlns:mc="http://schemas.openxmlformats.org/markup-compatibility/2006" xmlns:aink="http://schemas.microsoft.com/office/drawing/2016/ink" xmlns:am3d="http://schemas.microsoft.com/office/drawing/2017/model3d" xmlns:o="urn:schemas-microsoft-com:office:office" xmlns:oel="http://schemas.microsoft.com/office/2019/extlst" xmlns:r="http://schemas.openxmlformats.org/officeDocument/2006/relationships" xmlns:m="http://schemas.openxmlformats.org/officeDocument/2006/math" xmlns:v="urn:schemas-microsoft-com:vml" xmlns:wp14="http://schemas.microsoft.com/office/word/2010/wordprocessingDrawing" xmlns:wp="http://schemas.openxmlformats.org/drawingml/2006/wordprocessingDrawing" xmlns:w10="urn:schemas-microsoft-com:office:word" xmlns:w="http://schemas.openxmlformats.org/wordprocessingml/2006/main" xmlns:w14="http://schemas.microsoft.com/office/word/2010/wordml" xmlns:w15="http://schemas.microsoft.com/office/word/2012/wordml" xmlns:w16cex="http://schemas.microsoft.com/office/word/2018/wordml/cex" xmlns:w16cid="http://schemas.microsoft.com/office/word/2016/wordml/cid" xmlns:w16="http://schemas.microsoft.com/office/word/2018/wordml" xmlns:w16sdtdh="http://schemas.microsoft.com/office/word/2020/wordml/sdtdatahash" xmlns:w16se="http://schemas.microsoft.com/office/word/2015/wordml/symex" xmlns:wpg="http://schemas.microsoft.com/office/word/2010/wordprocessingGroup" xmlns:wpi="http://schemas.microsoft.com/office/word/2010/wordprocessingInk" xmlns:wne="http://schemas.microsoft.com/office/word/2006/wordml" xmlns:wps="http://schemas.microsoft.com/office/word/2010/wordprocessingShape" mc:Ignorable="w14 w15 w16se w16cid w16 w16cex w16sdtdh wp14">
   <w:body>
     <w:p>
       <w:pPr>
         <w:pStyle w:val="Text"/>
         <w:tabs>
-          <w:tab w:val="clear" w:pos="708"/>
-          <w:tab w:val="left" w:pos="5670" w:leader="none"/>
-        </w:tabs>
-        <w:rPr>
-          <w:rFonts w:ascii="Arial" w:hAnsi="Arial"/>
-        </w:rPr>
+          <w:tab w:val="left" w:pos="5670"/>
+        </w:tabs>
       </w:pPr>
       <w:r>
-        <w:rPr/>
         <w:tab/>
         <w:t>{{JURISTISCHER_NAME</w:t>
       </w:r>
       <w:bookmarkStart w:id="0" w:name="__DdeLink__121_2200098154"/>
       <w:r>
-        <w:rPr/>
         <w:t>}</w:t>
       </w:r>
       <w:bookmarkEnd w:id="0"/>
       <w:r>
-        <w:rPr/>
         <w:t>}</w:t>
       </w:r>
     </w:p>
@@ -33,15 +26,10 @@
       <w:pPr>
         <w:pStyle w:val="Text"/>
         <w:tabs>
-          <w:tab w:val="clear" w:pos="708"/>
-          <w:tab w:val="left" w:pos="5670" w:leader="none"/>
-        </w:tabs>
-        <w:rPr>
-          <w:rFonts w:ascii="Arial" w:hAnsi="Arial"/>
-        </w:rPr>
+          <w:tab w:val="left" w:pos="5670"/>
+        </w:tabs>
       </w:pPr>
       <w:r>
-        <w:rPr/>
         <w:tab/>
         <w:t>{{GESUCHSTELLER}}</w:t>
       </w:r>
@@ -50,15 +38,10 @@
       <w:pPr>
         <w:pStyle w:val="Text"/>
         <w:tabs>
-          <w:tab w:val="clear" w:pos="708"/>
-          <w:tab w:val="left" w:pos="5670" w:leader="none"/>
-        </w:tabs>
-        <w:rPr>
-          <w:rFonts w:ascii="Arial" w:hAnsi="Arial"/>
-        </w:rPr>
+          <w:tab w:val="left" w:pos="5670"/>
+        </w:tabs>
       </w:pPr>
       <w:r>
-        <w:rPr/>
         <w:tab/>
         <w:t>{{GESUCHSTELLER_ADRESSE_1}}</w:t>
       </w:r>
@@ -67,63 +50,41 @@
       <w:pPr>
         <w:pStyle w:val="Text"/>
         <w:tabs>
-          <w:tab w:val="clear" w:pos="708"/>
-          <w:tab w:val="left" w:pos="5670" w:leader="none"/>
-        </w:tabs>
-        <w:rPr>
-          <w:rFonts w:ascii="Arial" w:hAnsi="Arial"/>
-        </w:rPr>
+          <w:tab w:val="left" w:pos="5670"/>
+        </w:tabs>
       </w:pPr>
       <w:r>
-        <w:rPr/>
-        <w:t xml:space="preserve"> </w:t>
+        <w:t xml:space="preserve"> {{</w:t>
       </w:r>
       <w:r>
-        <w:rPr/>
-        <w:t>{{GESUCHSTELLER_ADRESSE_2}}</w:t>
+        <w:t>G</w:t>
+      </w:r>
+      <w:r>
+        <w:t>ESUCHSTELLER_ADRESSE_2}}</w:t>
       </w:r>
     </w:p>
     <w:p>
       <w:pPr>
         <w:pStyle w:val="Text"/>
         <w:rPr>
-          <w:rFonts w:ascii="Arial" w:hAnsi="Arial"/>
-          <w:b/>
           <w:b/>
         </w:rPr>
       </w:pPr>
-      <w:r>
+    </w:p>
+    <w:p>
+      <w:pPr>
+        <w:pStyle w:val="Text"/>
         <w:rPr>
           <w:b/>
         </w:rPr>
-      </w:r>
+      </w:pPr>
     </w:p>
     <w:p>
       <w:pPr>
-        <w:pStyle w:val="Text"/>
-        <w:rPr>
-          <w:rFonts w:ascii="Arial" w:hAnsi="Arial"/>
-          <w:b/>
-          <w:b/>
-        </w:rPr>
-      </w:pPr>
-      <w:r>
-        <w:rPr>
-          <w:b/>
-        </w:rPr>
-      </w:r>
-    </w:p>
-    <w:p>
-      <w:pPr>
-        <w:pStyle w:val="Normal"/>
-        <w:tabs>
-          <w:tab w:val="clear" w:pos="708"/>
-          <w:tab w:val="right" w:pos="9072" w:leader="none"/>
-        </w:tabs>
-        <w:spacing w:lineRule="atLeast" w:line="280"/>
-        <w:rPr>
-          <w:rFonts w:ascii="Arial" w:hAnsi="Arial"/>
-        </w:rPr>
+        <w:tabs>
+          <w:tab w:val="right" w:pos="9072"/>
+        </w:tabs>
+        <w:spacing w:line="280" w:lineRule="atLeast"/>
       </w:pPr>
       <w:r>
         <w:rPr>
@@ -143,53 +104,32 @@
     <w:p>
       <w:pPr>
         <w:pStyle w:val="Text"/>
-        <w:rPr>
-          <w:rFonts w:ascii="Arial" w:hAnsi="Arial"/>
-        </w:rPr>
-      </w:pPr>
-      <w:r>
-        <w:rPr/>
-      </w:r>
+      </w:pPr>
     </w:p>
     <w:tbl>
       <w:tblPr>
         <w:tblW w:w="9322" w:type="dxa"/>
-        <w:jc w:val="left"/>
-        <w:tblInd w:w="0" w:type="dxa"/>
         <w:tblLayout w:type="fixed"/>
-        <w:tblCellMar>
-          <w:top w:w="0" w:type="dxa"/>
-          <w:left w:w="108" w:type="dxa"/>
-          <w:bottom w:w="0" w:type="dxa"/>
-          <w:right w:w="108" w:type="dxa"/>
-        </w:tblCellMar>
-        <w:tblLook w:val="01e0" w:noHBand="0" w:noVBand="0" w:firstColumn="1" w:lastRow="1" w:lastColumn="1" w:firstRow="1"/>
+        <w:tblLook w:val="01E0" w:firstRow="1" w:lastRow="1" w:firstColumn="1" w:lastColumn="1" w:noHBand="0" w:noVBand="0"/>
       </w:tblPr>
       <w:tblGrid>
-        <w:gridCol w:w="2433"/>
+        <w:gridCol w:w="2434"/>
         <w:gridCol w:w="3188"/>
         <w:gridCol w:w="1398"/>
         <w:gridCol w:w="2302"/>
       </w:tblGrid>
       <w:tr>
-        <w:trPr/>
         <w:tc>
           <w:tcPr>
             <w:tcW w:w="2433" w:type="dxa"/>
-            <w:tcBorders/>
-            <w:shd w:color="auto" w:fill="auto" w:val="clear"/>
-          </w:tcPr>
-          <w:p>
-            <w:pPr>
-              <w:pStyle w:val="Normal"/>
-              <w:widowControl w:val="false"/>
-              <w:spacing w:lineRule="exact" w:line="280" w:before="120" w:after="0"/>
-              <w:rPr>
-                <w:rFonts w:ascii="Arial" w:hAnsi="Arial"/>
-              </w:rPr>
-            </w:pPr>
-            <w:r>
-              <w:rPr/>
+            <w:shd w:val="clear" w:color="auto" w:fill="auto"/>
+          </w:tcPr>
+          <w:p>
+            <w:pPr>
+              <w:widowControl w:val="0"/>
+              <w:spacing w:before="120" w:line="280" w:lineRule="exact"/>
+            </w:pPr>
+            <w:r>
               <w:t>Strasse:</w:t>
             </w:r>
           </w:p>
@@ -197,20 +137,14 @@
         <w:tc>
           <w:tcPr>
             <w:tcW w:w="3188" w:type="dxa"/>
-            <w:tcBorders/>
-            <w:shd w:color="auto" w:fill="auto" w:val="clear"/>
-          </w:tcPr>
-          <w:p>
-            <w:pPr>
-              <w:pStyle w:val="Normal"/>
-              <w:widowControl w:val="false"/>
-              <w:spacing w:lineRule="exact" w:line="280" w:before="120" w:after="0"/>
-              <w:rPr>
-                <w:rFonts w:ascii="Arial" w:hAnsi="Arial"/>
-              </w:rPr>
-            </w:pPr>
-            <w:r>
-              <w:rPr/>
+            <w:shd w:val="clear" w:color="auto" w:fill="auto"/>
+          </w:tcPr>
+          <w:p>
+            <w:pPr>
+              <w:widowControl w:val="0"/>
+              <w:spacing w:before="120" w:line="280" w:lineRule="exact"/>
+            </w:pPr>
+            <w:r>
               <w:t>{{ADRESSE}}</w:t>
             </w:r>
           </w:p>
@@ -218,20 +152,14 @@
         <w:tc>
           <w:tcPr>
             <w:tcW w:w="1398" w:type="dxa"/>
-            <w:tcBorders/>
-            <w:shd w:color="auto" w:fill="auto" w:val="clear"/>
-          </w:tcPr>
-          <w:p>
-            <w:pPr>
-              <w:pStyle w:val="Normal"/>
-              <w:widowControl w:val="false"/>
-              <w:spacing w:lineRule="exact" w:line="280" w:before="120" w:after="0"/>
-              <w:rPr>
-                <w:rFonts w:ascii="Arial" w:hAnsi="Arial"/>
-              </w:rPr>
-            </w:pPr>
-            <w:r>
-              <w:rPr/>
+            <w:shd w:val="clear" w:color="auto" w:fill="auto"/>
+          </w:tcPr>
+          <w:p>
+            <w:pPr>
+              <w:widowControl w:val="0"/>
+              <w:spacing w:before="120" w:line="280" w:lineRule="exact"/>
+            </w:pPr>
+            <w:r>
               <w:t>eBau-Nr.</w:t>
             </w:r>
           </w:p>
@@ -239,17 +167,12 @@
         <w:tc>
           <w:tcPr>
             <w:tcW w:w="2302" w:type="dxa"/>
-            <w:tcBorders/>
-            <w:shd w:color="auto" w:fill="auto" w:val="clear"/>
-          </w:tcPr>
-          <w:p>
-            <w:pPr>
-              <w:pStyle w:val="Normal"/>
-              <w:widowControl w:val="false"/>
-              <w:spacing w:lineRule="exact" w:line="280" w:before="120" w:after="0"/>
-              <w:rPr>
-                <w:rFonts w:ascii="Arial" w:hAnsi="Arial"/>
-              </w:rPr>
+            <w:shd w:val="clear" w:color="auto" w:fill="auto"/>
+          </w:tcPr>
+          <w:p>
+            <w:pPr>
+              <w:widowControl w:val="0"/>
+              <w:spacing w:before="120" w:line="280" w:lineRule="exact"/>
             </w:pPr>
             <w:r>
               <w:rPr>
@@ -261,24 +184,17 @@
         </w:tc>
       </w:tr>
       <w:tr>
-        <w:trPr/>
         <w:tc>
           <w:tcPr>
             <w:tcW w:w="2433" w:type="dxa"/>
-            <w:tcBorders/>
-            <w:shd w:color="auto" w:fill="auto" w:val="clear"/>
-          </w:tcPr>
-          <w:p>
-            <w:pPr>
-              <w:pStyle w:val="Normal"/>
-              <w:widowControl w:val="false"/>
-              <w:spacing w:lineRule="exact" w:line="280" w:before="120" w:after="0"/>
-              <w:rPr>
-                <w:rFonts w:ascii="Arial" w:hAnsi="Arial"/>
-              </w:rPr>
-            </w:pPr>
-            <w:r>
-              <w:rPr/>
+            <w:shd w:val="clear" w:color="auto" w:fill="auto"/>
+          </w:tcPr>
+          <w:p>
+            <w:pPr>
+              <w:widowControl w:val="0"/>
+              <w:spacing w:before="120" w:line="280" w:lineRule="exact"/>
+            </w:pPr>
+            <w:r>
               <w:t>Parzellen-Nr.:</w:t>
             </w:r>
           </w:p>
@@ -287,44 +203,31 @@
           <w:tcPr>
             <w:tcW w:w="6888" w:type="dxa"/>
             <w:gridSpan w:val="3"/>
-            <w:tcBorders/>
-            <w:shd w:color="auto" w:fill="auto" w:val="clear"/>
-          </w:tcPr>
-          <w:p>
-            <w:pPr>
-              <w:pStyle w:val="Normal"/>
-              <w:widowControl w:val="false"/>
-              <w:spacing w:lineRule="exact" w:line="280" w:before="120" w:after="0"/>
-              <w:rPr>
-                <w:rFonts w:ascii="Arial" w:hAnsi="Arial"/>
-              </w:rPr>
-            </w:pPr>
-            <w:r>
-              <w:rPr/>
+            <w:shd w:val="clear" w:color="auto" w:fill="auto"/>
+          </w:tcPr>
+          <w:p>
+            <w:pPr>
+              <w:widowControl w:val="0"/>
+              <w:spacing w:before="120" w:line="280" w:lineRule="exact"/>
+            </w:pPr>
+            <w:r>
               <w:t>{{PARZELLE}}</w:t>
             </w:r>
           </w:p>
         </w:tc>
       </w:tr>
       <w:tr>
-        <w:trPr/>
         <w:tc>
           <w:tcPr>
             <w:tcW w:w="2433" w:type="dxa"/>
-            <w:tcBorders/>
-            <w:shd w:color="auto" w:fill="auto" w:val="clear"/>
-          </w:tcPr>
-          <w:p>
-            <w:pPr>
-              <w:pStyle w:val="Normal"/>
-              <w:widowControl w:val="false"/>
-              <w:spacing w:lineRule="exact" w:line="280" w:before="120" w:after="0"/>
-              <w:rPr>
-                <w:rFonts w:ascii="Arial" w:hAnsi="Arial"/>
-              </w:rPr>
-            </w:pPr>
-            <w:r>
-              <w:rPr/>
+            <w:shd w:val="clear" w:color="auto" w:fill="auto"/>
+          </w:tcPr>
+          <w:p>
+            <w:pPr>
+              <w:widowControl w:val="0"/>
+              <w:spacing w:before="120" w:line="280" w:lineRule="exact"/>
+            </w:pPr>
+            <w:r>
               <w:t>Bauvorhaben:</w:t>
             </w:r>
           </w:p>
@@ -333,17 +236,12 @@
           <w:tcPr>
             <w:tcW w:w="6888" w:type="dxa"/>
             <w:gridSpan w:val="3"/>
-            <w:tcBorders/>
-            <w:shd w:color="auto" w:fill="auto" w:val="clear"/>
-          </w:tcPr>
-          <w:p>
-            <w:pPr>
-              <w:pStyle w:val="Normal"/>
-              <w:widowControl w:val="false"/>
-              <w:spacing w:lineRule="exact" w:line="280" w:before="120" w:after="0"/>
-              <w:rPr>
-                <w:rFonts w:ascii="Arial" w:hAnsi="Arial"/>
-              </w:rPr>
+            <w:shd w:val="clear" w:color="auto" w:fill="auto"/>
+          </w:tcPr>
+          <w:p>
+            <w:pPr>
+              <w:widowControl w:val="0"/>
+              <w:spacing w:before="120" w:line="280" w:lineRule="exact"/>
             </w:pPr>
             <w:r>
               <w:rPr>
@@ -355,24 +253,17 @@
         </w:tc>
       </w:tr>
       <w:tr>
-        <w:trPr/>
         <w:tc>
           <w:tcPr>
             <w:tcW w:w="2433" w:type="dxa"/>
-            <w:tcBorders/>
-            <w:shd w:color="auto" w:fill="auto" w:val="clear"/>
-          </w:tcPr>
-          <w:p>
-            <w:pPr>
-              <w:pStyle w:val="Normal"/>
-              <w:widowControl w:val="false"/>
-              <w:spacing w:lineRule="exact" w:line="280" w:before="120" w:after="0"/>
-              <w:rPr>
-                <w:rFonts w:ascii="Arial" w:hAnsi="Arial"/>
-              </w:rPr>
-            </w:pPr>
-            <w:r>
-              <w:rPr/>
+            <w:shd w:val="clear" w:color="auto" w:fill="auto"/>
+          </w:tcPr>
+          <w:p>
+            <w:pPr>
+              <w:widowControl w:val="0"/>
+              <w:spacing w:before="120" w:line="280" w:lineRule="exact"/>
+            </w:pPr>
+            <w:r>
               <w:t>Gesuchsteller/in:</w:t>
             </w:r>
           </w:p>
@@ -381,17 +272,12 @@
           <w:tcPr>
             <w:tcW w:w="6888" w:type="dxa"/>
             <w:gridSpan w:val="3"/>
-            <w:tcBorders/>
-            <w:shd w:color="auto" w:fill="auto" w:val="clear"/>
-          </w:tcPr>
-          <w:p>
-            <w:pPr>
-              <w:pStyle w:val="Normal"/>
-              <w:widowControl w:val="false"/>
-              <w:spacing w:lineRule="exact" w:line="280" w:before="120" w:after="0"/>
-              <w:rPr>
-                <w:rFonts w:ascii="Arial" w:hAnsi="Arial"/>
-              </w:rPr>
+            <w:shd w:val="clear" w:color="auto" w:fill="auto"/>
+          </w:tcPr>
+          <w:p>
+            <w:pPr>
+              <w:widowControl w:val="0"/>
+              <w:spacing w:before="120" w:line="280" w:lineRule="exact"/>
             </w:pPr>
             <w:r>
               <w:rPr>
@@ -403,24 +289,17 @@
         </w:tc>
       </w:tr>
       <w:tr>
-        <w:trPr/>
         <w:tc>
           <w:tcPr>
             <w:tcW w:w="2433" w:type="dxa"/>
-            <w:tcBorders/>
-            <w:shd w:color="auto" w:fill="auto" w:val="clear"/>
-          </w:tcPr>
-          <w:p>
-            <w:pPr>
-              <w:pStyle w:val="Normal"/>
-              <w:widowControl w:val="false"/>
-              <w:spacing w:lineRule="exact" w:line="280" w:before="120" w:after="0"/>
-              <w:rPr>
-                <w:rFonts w:ascii="Arial" w:hAnsi="Arial"/>
-              </w:rPr>
-            </w:pPr>
-            <w:r>
-              <w:rPr/>
+            <w:shd w:val="clear" w:color="auto" w:fill="auto"/>
+          </w:tcPr>
+          <w:p>
+            <w:pPr>
+              <w:widowControl w:val="0"/>
+              <w:spacing w:before="120" w:line="280" w:lineRule="exact"/>
+            </w:pPr>
+            <w:r>
               <w:t>Projektverfasser/in:</w:t>
             </w:r>
           </w:p>
@@ -429,17 +308,12 @@
           <w:tcPr>
             <w:tcW w:w="6888" w:type="dxa"/>
             <w:gridSpan w:val="3"/>
-            <w:tcBorders/>
-            <w:shd w:color="auto" w:fill="auto" w:val="clear"/>
-          </w:tcPr>
-          <w:p>
-            <w:pPr>
-              <w:pStyle w:val="Normal"/>
-              <w:widowControl w:val="false"/>
-              <w:spacing w:lineRule="exact" w:line="280" w:before="120" w:after="0"/>
-              <w:rPr>
-                <w:rFonts w:ascii="Arial" w:hAnsi="Arial"/>
-              </w:rPr>
+            <w:shd w:val="clear" w:color="auto" w:fill="auto"/>
+          </w:tcPr>
+          <w:p>
+            <w:pPr>
+              <w:widowControl w:val="0"/>
+              <w:spacing w:before="120" w:line="280" w:lineRule="exact"/>
             </w:pPr>
             <w:r>
               <w:rPr>
@@ -451,24 +325,17 @@
         </w:tc>
       </w:tr>
       <w:tr>
-        <w:trPr/>
         <w:tc>
           <w:tcPr>
             <w:tcW w:w="2433" w:type="dxa"/>
-            <w:tcBorders/>
-            <w:shd w:color="auto" w:fill="auto" w:val="clear"/>
-          </w:tcPr>
-          <w:p>
-            <w:pPr>
-              <w:pStyle w:val="Normal"/>
-              <w:widowControl w:val="false"/>
-              <w:spacing w:lineRule="exact" w:line="280" w:before="120" w:after="0"/>
-              <w:rPr>
-                <w:rFonts w:ascii="Arial" w:hAnsi="Arial"/>
-              </w:rPr>
-            </w:pPr>
-            <w:r>
-              <w:rPr/>
+            <w:shd w:val="clear" w:color="auto" w:fill="auto"/>
+          </w:tcPr>
+          <w:p>
+            <w:pPr>
+              <w:widowControl w:val="0"/>
+              <w:spacing w:before="120" w:line="280" w:lineRule="exact"/>
+            </w:pPr>
+            <w:r>
               <w:t>Leitbehörde:</w:t>
             </w:r>
           </w:p>
@@ -477,17 +344,12 @@
           <w:tcPr>
             <w:tcW w:w="6888" w:type="dxa"/>
             <w:gridSpan w:val="3"/>
-            <w:tcBorders/>
-            <w:shd w:color="auto" w:fill="auto" w:val="clear"/>
-          </w:tcPr>
-          <w:p>
-            <w:pPr>
-              <w:pStyle w:val="Normal"/>
-              <w:widowControl w:val="false"/>
-              <w:spacing w:lineRule="exact" w:line="280" w:before="120" w:after="0"/>
-              <w:rPr>
-                <w:rFonts w:ascii="Arial" w:hAnsi="Arial"/>
-              </w:rPr>
+            <w:shd w:val="clear" w:color="auto" w:fill="auto"/>
+          </w:tcPr>
+          <w:p>
+            <w:pPr>
+              <w:widowControl w:val="0"/>
+              <w:spacing w:before="120" w:line="280" w:lineRule="exact"/>
             </w:pPr>
             <w:r>
               <w:rPr>
@@ -499,24 +361,17 @@
         </w:tc>
       </w:tr>
       <w:tr>
-        <w:trPr/>
         <w:tc>
           <w:tcPr>
             <w:tcW w:w="2433" w:type="dxa"/>
-            <w:tcBorders/>
-            <w:shd w:color="auto" w:fill="auto" w:val="clear"/>
-          </w:tcPr>
-          <w:p>
-            <w:pPr>
-              <w:pStyle w:val="Normal"/>
-              <w:widowControl w:val="false"/>
-              <w:spacing w:lineRule="exact" w:line="280" w:before="120" w:after="0"/>
-              <w:rPr>
-                <w:rFonts w:ascii="Arial" w:hAnsi="Arial"/>
-              </w:rPr>
-            </w:pPr>
-            <w:r>
-              <w:rPr/>
+            <w:shd w:val="clear" w:color="auto" w:fill="auto"/>
+          </w:tcPr>
+          <w:p>
+            <w:pPr>
+              <w:widowControl w:val="0"/>
+              <w:spacing w:before="120" w:line="280" w:lineRule="exact"/>
+            </w:pPr>
+            <w:r>
               <w:t>Kontaktperson:</w:t>
             </w:r>
           </w:p>
@@ -524,20 +379,14 @@
         <w:tc>
           <w:tcPr>
             <w:tcW w:w="3188" w:type="dxa"/>
-            <w:tcBorders/>
-            <w:shd w:color="auto" w:fill="auto" w:val="clear"/>
-          </w:tcPr>
-          <w:p>
-            <w:pPr>
-              <w:pStyle w:val="Normal"/>
-              <w:widowControl w:val="false"/>
-              <w:spacing w:lineRule="exact" w:line="280" w:before="120" w:after="0"/>
-              <w:rPr>
-                <w:rFonts w:ascii="Arial" w:hAnsi="Arial"/>
-              </w:rPr>
-            </w:pPr>
-            <w:r>
-              <w:rPr/>
+            <w:shd w:val="clear" w:color="auto" w:fill="auto"/>
+          </w:tcPr>
+          <w:p>
+            <w:pPr>
+              <w:widowControl w:val="0"/>
+              <w:spacing w:before="120" w:line="280" w:lineRule="exact"/>
+            </w:pPr>
+            <w:r>
               <w:t>{{LEITPERSON}}</w:t>
             </w:r>
           </w:p>
@@ -545,20 +394,14 @@
         <w:tc>
           <w:tcPr>
             <w:tcW w:w="1398" w:type="dxa"/>
-            <w:tcBorders/>
-            <w:shd w:color="auto" w:fill="auto" w:val="clear"/>
-          </w:tcPr>
-          <w:p>
-            <w:pPr>
-              <w:pStyle w:val="Normal"/>
-              <w:widowControl w:val="false"/>
-              <w:spacing w:lineRule="exact" w:line="280" w:before="120" w:after="0"/>
-              <w:rPr>
-                <w:rFonts w:ascii="Arial" w:hAnsi="Arial"/>
-              </w:rPr>
-            </w:pPr>
-            <w:r>
-              <w:rPr/>
+            <w:shd w:val="clear" w:color="auto" w:fill="auto"/>
+          </w:tcPr>
+          <w:p>
+            <w:pPr>
+              <w:widowControl w:val="0"/>
+              <w:spacing w:before="120" w:line="280" w:lineRule="exact"/>
+            </w:pPr>
+            <w:r>
               <w:t>Telefon-Nr.</w:t>
             </w:r>
           </w:p>
@@ -566,23 +409,16 @@
         <w:tc>
           <w:tcPr>
             <w:tcW w:w="2302" w:type="dxa"/>
-            <w:tcBorders/>
-            <w:shd w:color="auto" w:fill="auto" w:val="clear"/>
-          </w:tcPr>
-          <w:p>
-            <w:pPr>
-              <w:pStyle w:val="Normal"/>
-              <w:widowControl w:val="false"/>
-              <w:spacing w:lineRule="exact" w:line="280" w:before="120" w:after="0"/>
-              <w:rPr>
-                <w:highlight w:val="none"/>
-                <w:shd w:fill="auto" w:val="clear"/>
-              </w:rPr>
+            <w:shd w:val="clear" w:color="auto" w:fill="auto"/>
+          </w:tcPr>
+          <w:p>
+            <w:pPr>
+              <w:widowControl w:val="0"/>
+              <w:spacing w:before="120" w:line="280" w:lineRule="exact"/>
             </w:pPr>
             <w:r>
               <w:rPr>
                 <w:color w:val="000000"/>
-                <w:shd w:fill="auto" w:val="clear"/>
               </w:rPr>
               <w:t>{{LEITBEHOERDE_TELEFON}}</w:t>
             </w:r>
@@ -592,26 +428,14 @@
     </w:tbl>
     <w:p>
       <w:pPr>
-        <w:pStyle w:val="Normal"/>
-        <w:rPr>
-          <w:rFonts w:ascii="Arial" w:hAnsi="Arial"/>
-          <w:b/>
-          <w:b/>
-        </w:rPr>
-      </w:pPr>
-      <w:r>
         <w:rPr>
           <w:b/>
         </w:rPr>
-      </w:r>
+      </w:pPr>
     </w:p>
     <w:p>
       <w:pPr>
-        <w:pStyle w:val="Normal"/>
-        <w:spacing w:lineRule="exact" w:line="280"/>
-        <w:rPr>
-          <w:rFonts w:ascii="Arial" w:hAnsi="Arial"/>
-        </w:rPr>
+        <w:spacing w:line="280" w:lineRule="exact"/>
       </w:pPr>
       <w:r>
         <w:rPr>
@@ -622,87 +446,59 @@
     </w:p>
     <w:p>
       <w:pPr>
-        <w:pStyle w:val="Normal"/>
-        <w:spacing w:lineRule="exact" w:line="280"/>
-        <w:rPr>
-          <w:rFonts w:ascii="Arial" w:hAnsi="Arial"/>
-        </w:rPr>
-      </w:pPr>
-      <w:r>
-        <w:rPr/>
-      </w:r>
+        <w:spacing w:line="280" w:lineRule="exact"/>
+      </w:pPr>
     </w:p>
     <w:p>
       <w:pPr>
-        <w:pStyle w:val="Normal"/>
-        <w:tabs>
-          <w:tab w:val="clear" w:pos="708"/>
-          <w:tab w:val="right" w:pos="9070" w:leader="none"/>
-        </w:tabs>
-        <w:spacing w:lineRule="exact" w:line="280"/>
-        <w:rPr>
-          <w:rFonts w:ascii="Arial" w:hAnsi="Arial"/>
-        </w:rPr>
+        <w:tabs>
+          <w:tab w:val="right" w:pos="9070"/>
+        </w:tabs>
+        <w:spacing w:line="280" w:lineRule="exact"/>
       </w:pPr>
       <w:r>
-        <w:rPr/>
         <w:t>Mit diesem Schreiben erhalten Sie die Bestätigung, dass der geplante oder bereits erfolgte Wärmeerzeugerersatz gesetzeskonform nach Art. 40a KEnG und Art. 20a KEnV erfolgt ist.</w:t>
       </w:r>
     </w:p>
     <w:p>
       <w:pPr>
-        <w:pStyle w:val="Normal"/>
-        <w:tabs>
-          <w:tab w:val="clear" w:pos="708"/>
-          <w:tab w:val="right" w:pos="9070" w:leader="none"/>
-        </w:tabs>
-        <w:spacing w:lineRule="exact" w:line="280"/>
-        <w:rPr>
-          <w:rFonts w:ascii="Arial" w:hAnsi="Arial"/>
-          <w:b/>
-          <w:b/>
-        </w:rPr>
-      </w:pPr>
-      <w:r>
+        <w:tabs>
+          <w:tab w:val="right" w:pos="9070"/>
+        </w:tabs>
+        <w:spacing w:line="280" w:lineRule="exact"/>
         <w:rPr>
           <w:b/>
         </w:rPr>
-      </w:r>
+      </w:pPr>
     </w:p>
     <w:p>
       <w:pPr>
-        <w:pStyle w:val="Normal"/>
-        <w:tabs>
-          <w:tab w:val="clear" w:pos="708"/>
-          <w:tab w:val="right" w:pos="9070" w:leader="none"/>
-        </w:tabs>
-        <w:spacing w:lineRule="exact" w:line="280"/>
-        <w:rPr>
-          <w:rFonts w:ascii="Arial" w:hAnsi="Arial"/>
-        </w:rPr>
+        <w:tabs>
+          <w:tab w:val="right" w:pos="9070"/>
+        </w:tabs>
+        <w:spacing w:line="280" w:lineRule="exact"/>
       </w:pPr>
       <w:r>
-        <w:rPr/>
         <w:t>Zwei Situationen der Bestätigung sind zu unterscheiden.</w:t>
       </w:r>
     </w:p>
     <w:p>
       <w:pPr>
-        <w:pStyle w:val="Normal"/>
-        <w:tabs>
-          <w:tab w:val="clear" w:pos="708"/>
-          <w:tab w:val="right" w:pos="9070" w:leader="none"/>
-        </w:tabs>
-        <w:spacing w:lineRule="exact" w:line="280"/>
-        <w:rPr>
-          <w:rFonts w:ascii="Arial" w:hAnsi="Arial"/>
-        </w:rPr>
+        <w:tabs>
+          <w:tab w:val="right" w:pos="9070"/>
+        </w:tabs>
+        <w:spacing w:line="280" w:lineRule="exact"/>
       </w:pPr>
       <w:r>
         <w:rPr>
           <w:b/>
         </w:rPr>
         <w:t>Situation:</w:t>
+      </w:r>
+      <w:r>
+        <w:rPr>
+          <w:b/>
+        </w:rPr>
         <w:tab/>
         <w:t>trifft zu:</w:t>
       </w:r>
@@ -710,78 +506,63 @@
     <w:tbl>
       <w:tblPr>
         <w:tblW w:w="9075" w:type="dxa"/>
-        <w:jc w:val="left"/>
-        <w:tblInd w:w="0" w:type="dxa"/>
         <w:tblLayout w:type="fixed"/>
         <w:tblCellMar>
-          <w:top w:w="0" w:type="dxa"/>
           <w:left w:w="0" w:type="dxa"/>
-          <w:bottom w:w="0" w:type="dxa"/>
           <w:right w:w="0" w:type="dxa"/>
         </w:tblCellMar>
-        <w:tblLook w:val="04a0" w:noHBand="0" w:noVBand="1" w:firstColumn="1" w:lastRow="0" w:lastColumn="0" w:firstRow="1"/>
+        <w:tblLook w:val="04A0" w:firstRow="1" w:lastRow="0" w:firstColumn="1" w:lastColumn="0" w:noHBand="0" w:noVBand="1"/>
       </w:tblPr>
       <w:tblGrid>
-        <w:gridCol w:w="8221"/>
+        <w:gridCol w:w="8222"/>
         <w:gridCol w:w="853"/>
       </w:tblGrid>
       <w:tr>
         <w:trPr>
-          <w:tblHeader w:val="true"/>
+          <w:tblHeader/>
         </w:trPr>
         <w:tc>
           <w:tcPr>
             <w:tcW w:w="8221" w:type="dxa"/>
-            <w:tcBorders/>
-            <w:shd w:color="auto" w:fill="auto" w:val="clear"/>
-          </w:tcPr>
-          <w:p>
-            <w:pPr>
-              <w:pStyle w:val="Normal"/>
-              <w:widowControl w:val="false"/>
+            <w:shd w:val="clear" w:color="auto" w:fill="auto"/>
+          </w:tcPr>
+          <w:p>
+            <w:pPr>
+              <w:widowControl w:val="0"/>
               <w:tabs>
-                <w:tab w:val="clear" w:pos="708"/>
-                <w:tab w:val="right" w:pos="9070" w:leader="none"/>
+                <w:tab w:val="right" w:pos="9070"/>
               </w:tabs>
-              <w:spacing w:lineRule="exact" w:line="280"/>
-              <w:rPr>
-                <w:rFonts w:ascii="Arial" w:hAnsi="Arial"/>
-              </w:rPr>
+              <w:spacing w:line="280" w:lineRule="exact"/>
             </w:pPr>
             <w:r>
               <w:rPr>
                 <w:color w:val="333333"/>
                 <w:u w:val="single"/>
-                <w:shd w:fill="FFFFFF" w:val="clear"/>
+                <w:shd w:val="clear" w:color="auto" w:fill="FFFFFF"/>
               </w:rPr>
               <w:t>Wärmeerzeugerersatz gesetzeskonform abgeschlossen</w:t>
             </w:r>
             <w:r>
               <w:rPr>
                 <w:color w:val="333333"/>
-                <w:shd w:fill="FFFFFF" w:val="clear"/>
+                <w:shd w:val="clear" w:color="auto" w:fill="FFFFFF"/>
               </w:rPr>
               <w:t>;</w:t>
             </w:r>
           </w:p>
           <w:p>
             <w:pPr>
-              <w:pStyle w:val="Normal"/>
-              <w:widowControl w:val="false"/>
+              <w:widowControl w:val="0"/>
               <w:tabs>
-                <w:tab w:val="clear" w:pos="708"/>
-                <w:tab w:val="right" w:pos="9070" w:leader="none"/>
+                <w:tab w:val="right" w:pos="9070"/>
               </w:tabs>
-              <w:spacing w:lineRule="exact" w:line="280"/>
-              <w:rPr>
-                <w:rFonts w:ascii="Arial" w:hAnsi="Arial"/>
-              </w:rPr>
+              <w:spacing w:line="280" w:lineRule="exact"/>
             </w:pPr>
             <w:r>
               <w:rPr>
                 <w:i/>
                 <w:color w:val="333333"/>
-                <w:shd w:fill="FFFFFF" w:val="clear"/>
+                <w:shd w:val="clear" w:color="auto" w:fill="FFFFFF"/>
               </w:rPr>
               <w:t xml:space="preserve">beim Nachweis, dass mindestens die </w:t>
             </w:r>
@@ -790,7 +571,7 @@
                 <w:b/>
                 <w:i/>
                 <w:color w:val="333333"/>
-                <w:shd w:fill="FFFFFF" w:val="clear"/>
+                <w:shd w:val="clear" w:color="auto" w:fill="FFFFFF"/>
               </w:rPr>
               <w:t>Gesamtenergieeffizienzklasse D</w:t>
             </w:r>
@@ -798,7 +579,7 @@
               <w:rPr>
                 <w:i/>
                 <w:color w:val="333333"/>
-                <w:shd w:fill="FFFFFF" w:val="clear"/>
+                <w:shd w:val="clear" w:color="auto" w:fill="FFFFFF"/>
               </w:rPr>
               <w:t xml:space="preserve"> nach dem Gebäudeenergieausweis der Kantone (</w:t>
             </w:r>
@@ -807,7 +588,7 @@
                 <w:b/>
                 <w:i/>
                 <w:color w:val="333333"/>
-                <w:shd w:fill="FFFFFF" w:val="clear"/>
+                <w:shd w:val="clear" w:color="auto" w:fill="FFFFFF"/>
               </w:rPr>
               <w:t>GEAK</w:t>
             </w:r>
@@ -815,7 +596,7 @@
               <w:rPr>
                 <w:i/>
                 <w:color w:val="333333"/>
-                <w:shd w:fill="FFFFFF" w:val="clear"/>
+                <w:shd w:val="clear" w:color="auto" w:fill="FFFFFF"/>
               </w:rPr>
               <w:t xml:space="preserve">) erreicht wird, ein </w:t>
             </w:r>
@@ -824,7 +605,7 @@
                 <w:b/>
                 <w:i/>
                 <w:color w:val="333333"/>
-                <w:shd w:fill="FFFFFF" w:val="clear"/>
+                <w:shd w:val="clear" w:color="auto" w:fill="FFFFFF"/>
               </w:rPr>
               <w:t>gültiges Minergie-Zertifikat</w:t>
             </w:r>
@@ -832,7 +613,7 @@
               <w:rPr>
                 <w:i/>
                 <w:color w:val="333333"/>
-                <w:shd w:fill="FFFFFF" w:val="clear"/>
+                <w:shd w:val="clear" w:color="auto" w:fill="FFFFFF"/>
               </w:rPr>
               <w:t xml:space="preserve"> vorliegt oder vertraglich </w:t>
             </w:r>
@@ -841,7 +622,7 @@
                 <w:b/>
                 <w:i/>
                 <w:color w:val="333333"/>
-                <w:shd w:fill="FFFFFF" w:val="clear"/>
+                <w:shd w:val="clear" w:color="auto" w:fill="FFFFFF"/>
               </w:rPr>
               <w:t>50 % mehr erneuerbares Gas</w:t>
             </w:r>
@@ -849,7 +630,7 @@
               <w:rPr>
                 <w:i/>
                 <w:color w:val="333333"/>
-                <w:shd w:fill="FFFFFF" w:val="clear"/>
+                <w:shd w:val="clear" w:color="auto" w:fill="FFFFFF"/>
               </w:rPr>
               <w:t xml:space="preserve"> bezogen wird.</w:t>
             </w:r>
@@ -858,17 +639,13 @@
         <w:tc>
           <w:tcPr>
             <w:tcW w:w="853" w:type="dxa"/>
-            <w:tcBorders/>
-            <w:shd w:color="auto" w:fill="auto" w:val="clear"/>
+            <w:shd w:val="clear" w:color="auto" w:fill="auto"/>
           </w:tcPr>
           <w:p>
             <w:pPr>
               <w:pStyle w:val="TableContents"/>
-              <w:widowControl w:val="false"/>
+              <w:widowControl w:val="0"/>
               <w:jc w:val="right"/>
-              <w:rPr>
-                <w:rFonts w:ascii="Arial" w:hAnsi="Arial"/>
-              </w:rPr>
             </w:pPr>
             <w:r>
               <w:rPr>
@@ -881,48 +658,48 @@
       </w:tr>
       <w:tr>
         <w:trPr>
-          <w:tblHeader w:val="true"/>
+          <w:tblHeader/>
         </w:trPr>
         <w:tc>
           <w:tcPr>
             <w:tcW w:w="8221" w:type="dxa"/>
-            <w:tcBorders/>
-            <w:shd w:color="auto" w:fill="auto" w:val="clear"/>
-          </w:tcPr>
-          <w:p>
-            <w:pPr>
-              <w:pStyle w:val="Normal"/>
-              <w:widowControl w:val="false"/>
+            <w:shd w:val="clear" w:color="auto" w:fill="auto"/>
+          </w:tcPr>
+          <w:p>
+            <w:pPr>
+              <w:widowControl w:val="0"/>
               <w:tabs>
-                <w:tab w:val="clear" w:pos="708"/>
-                <w:tab w:val="right" w:pos="9070" w:leader="none"/>
+                <w:tab w:val="right" w:pos="9070"/>
               </w:tabs>
-              <w:spacing w:lineRule="exact" w:line="280"/>
-              <w:rPr>
-                <w:rFonts w:ascii="Arial" w:hAnsi="Arial"/>
-              </w:rPr>
+              <w:spacing w:line="280" w:lineRule="exact"/>
             </w:pPr>
             <w:r>
               <w:rPr>
                 <w:color w:val="333333"/>
                 <w:u w:val="single"/>
-                <w:shd w:fill="FFFFFF" w:val="clear"/>
+                <w:shd w:val="clear" w:color="auto" w:fill="FFFFFF"/>
               </w:rPr>
               <w:t>Wärmeerzeugerersatz noch nicht gesetzeskonform abgeschlossen</w:t>
             </w:r>
             <w:r>
               <w:rPr>
                 <w:color w:val="333333"/>
-                <w:shd w:fill="FFFFFF" w:val="clear"/>
+                <w:shd w:val="clear" w:color="auto" w:fill="FFFFFF"/>
               </w:rPr>
               <w:t>;</w:t>
+            </w:r>
+            <w:r>
+              <w:rPr>
+                <w:color w:val="333333"/>
+                <w:shd w:val="clear" w:color="auto" w:fill="FFFFFF"/>
+              </w:rPr>
               <w:br/>
             </w:r>
             <w:r>
               <w:rPr>
                 <w:i/>
                 <w:color w:val="333333"/>
-                <w:shd w:fill="FFFFFF" w:val="clear"/>
+                <w:shd w:val="clear" w:color="auto" w:fill="FFFFFF"/>
               </w:rPr>
               <w:t xml:space="preserve">beim Nachweis der fachgerechten Umsetzung einer </w:t>
             </w:r>
@@ -931,117 +708,80 @@
                 <w:b/>
                 <w:i/>
                 <w:color w:val="333333"/>
-                <w:shd w:fill="FFFFFF" w:val="clear"/>
+                <w:shd w:val="clear" w:color="auto" w:fill="FFFFFF"/>
               </w:rPr>
               <w:t>Standardlösung</w:t>
             </w:r>
           </w:p>
           <w:p>
             <w:pPr>
-              <w:pStyle w:val="ListParagraph"/>
-              <w:widowControl w:val="false"/>
+              <w:pStyle w:val="Listenabsatz"/>
+              <w:widowControl w:val="0"/>
               <w:numPr>
                 <w:ilvl w:val="0"/>
                 <w:numId w:val="1"/>
               </w:numPr>
               <w:tabs>
-                <w:tab w:val="clear" w:pos="708"/>
-                <w:tab w:val="right" w:pos="9070" w:leader="none"/>
+                <w:tab w:val="right" w:pos="9070"/>
               </w:tabs>
-              <w:spacing w:lineRule="exact" w:line="280"/>
-              <w:rPr>
-                <w:rFonts w:ascii="Arial" w:hAnsi="Arial"/>
-              </w:rPr>
+              <w:spacing w:line="280" w:lineRule="exact"/>
             </w:pPr>
             <w:r>
               <w:rPr>
                 <w:color w:val="333333"/>
                 <w:u w:val="single"/>
-                <w:shd w:fill="FFFFFF" w:val="clear"/>
+                <w:shd w:val="clear" w:color="auto" w:fill="FFFFFF"/>
               </w:rPr>
               <w:t>Baubewilligungspflichtige Massnahmen</w:t>
             </w:r>
             <w:r>
               <w:rPr>
                 <w:color w:val="333333"/>
-                <w:shd w:fill="FFFFFF" w:val="clear"/>
-              </w:rPr>
-              <w:t xml:space="preserve">: Baugesuch ist bis spätestens vor nächster Heizperiode (15. September) einzureichen. Die Umsetzung der </w:t>
-            </w:r>
-            <w:r>
-              <w:rPr>
-                <w:color w:val="333333"/>
-                <w:u w:val="none"/>
-                <w:shd w:fill="FFFFFF" w:val="clear"/>
-              </w:rPr>
-              <w:t>Massnahme erfolgt innerhalb von längstens 3 Jahren nach Baubewilligung.</w:t>
-            </w:r>
-          </w:p>
-          <w:p>
-            <w:pPr>
-              <w:pStyle w:val="ListParagraph"/>
-              <w:widowControl w:val="false"/>
+                <w:shd w:val="clear" w:color="auto" w:fill="FFFFFF"/>
+              </w:rPr>
+              <w:t>: Baugesuch ist bis spätestens vor nächster Heizperiode (15. September) einzureichen. Die Umsetzung der Massnahme erfolgt innerhalb von längstens 3 Jahren nach Baubewilligung.</w:t>
+            </w:r>
+          </w:p>
+          <w:p>
+            <w:pPr>
+              <w:pStyle w:val="Listenabsatz"/>
+              <w:widowControl w:val="0"/>
               <w:numPr>
                 <w:ilvl w:val="0"/>
                 <w:numId w:val="1"/>
               </w:numPr>
               <w:tabs>
-                <w:tab w:val="clear" w:pos="708"/>
-                <w:tab w:val="right" w:pos="9070" w:leader="none"/>
+                <w:tab w:val="right" w:pos="9070"/>
               </w:tabs>
-              <w:spacing w:lineRule="exact" w:line="280"/>
-              <w:rPr>
-                <w:rFonts w:ascii="Arial" w:hAnsi="Arial"/>
-              </w:rPr>
+              <w:spacing w:line="280" w:lineRule="exact"/>
             </w:pPr>
             <w:r>
               <w:rPr>
                 <w:color w:val="333333"/>
                 <w:u w:val="single"/>
-                <w:shd w:fill="FFFFFF" w:val="clear"/>
+                <w:shd w:val="clear" w:color="auto" w:fill="FFFFFF"/>
               </w:rPr>
               <w:t>Baubewilligungsfreie Massnahmen</w:t>
             </w:r>
             <w:r>
               <w:rPr>
                 <w:color w:val="333333"/>
-                <w:u w:val="none"/>
-                <w:shd w:fill="FFFFFF" w:val="clear"/>
-              </w:rPr>
-              <w:t>:</w:t>
-            </w:r>
-            <w:r>
-              <w:rPr>
-                <w:color w:val="333333"/>
-                <w:shd w:fill="FFFFFF" w:val="clear"/>
-              </w:rPr>
-              <w:t xml:space="preserve"> Meldung hat bis spätestens vor nächster Heizperiode (15. September) zu erfolgen. Die Umsetzung von baubewilligungsfreien Massnahmen erfolgt innerhalb von längstens 1 Jahr</w:t>
-            </w:r>
-            <w:bookmarkStart w:id="1" w:name="_GoBack"/>
-            <w:bookmarkEnd w:id="1"/>
-            <w:r>
-              <w:rPr>
-                <w:color w:val="333333"/>
-                <w:shd w:fill="FFFFFF" w:val="clear"/>
-              </w:rPr>
-              <w:t>.</w:t>
+                <w:shd w:val="clear" w:color="auto" w:fill="FFFFFF"/>
+              </w:rPr>
+              <w:t>: Meldung hat bis spätestens vor nächster Heizperiode (15. September) zu erfolgen. Die Umsetzung von baubewilligungsfreien Massnahmen erfolgt innerhalb von längstens 1 Jahr.</w:t>
             </w:r>
           </w:p>
         </w:tc>
         <w:tc>
           <w:tcPr>
             <w:tcW w:w="853" w:type="dxa"/>
-            <w:tcBorders/>
-            <w:shd w:color="auto" w:fill="auto" w:val="clear"/>
+            <w:shd w:val="clear" w:color="auto" w:fill="auto"/>
           </w:tcPr>
           <w:p>
             <w:pPr>
               <w:pStyle w:val="TableContents"/>
-              <w:widowControl w:val="false"/>
+              <w:widowControl w:val="0"/>
               <w:jc w:val="right"/>
-              <w:rPr>
-                <w:rFonts w:ascii="Arial" w:hAnsi="Arial"/>
-              </w:rPr>
             </w:pPr>
             <w:r>
               <w:rPr>
@@ -1055,44 +795,32 @@
     </w:tbl>
     <w:p>
       <w:pPr>
-        <w:pStyle w:val="Normal"/>
-        <w:tabs>
-          <w:tab w:val="clear" w:pos="708"/>
-          <w:tab w:val="right" w:pos="9070" w:leader="none"/>
-        </w:tabs>
-        <w:spacing w:lineRule="exact" w:line="280"/>
-        <w:rPr>
-          <w:rFonts w:ascii="Arial" w:hAnsi="Arial"/>
-          <w:b w:val="false"/>
-          <w:b w:val="false"/>
-          <w:bCs w:val="false"/>
-        </w:rPr>
+        <w:tabs>
+          <w:tab w:val="right" w:pos="9070"/>
+        </w:tabs>
+        <w:spacing w:line="280" w:lineRule="exact"/>
       </w:pPr>
       <w:r>
-        <w:rPr>
-          <w:b w:val="false"/>
-          <w:bCs w:val="false"/>
-        </w:rPr>
         <w:t>{% if ZIRKULATION_ALLE %}</w:t>
       </w:r>
     </w:p>
     <w:p>
       <w:pPr>
-        <w:pStyle w:val="Normal"/>
-        <w:tabs>
-          <w:tab w:val="clear" w:pos="708"/>
-          <w:tab w:val="right" w:pos="9070" w:leader="none"/>
-        </w:tabs>
-        <w:spacing w:lineRule="exact" w:line="280"/>
-        <w:rPr>
-          <w:rFonts w:ascii="Arial" w:hAnsi="Arial"/>
-        </w:rPr>
+        <w:tabs>
+          <w:tab w:val="right" w:pos="9070"/>
+        </w:tabs>
+        <w:spacing w:line="280" w:lineRule="exact"/>
       </w:pPr>
       <w:r>
         <w:rPr>
           <w:b/>
         </w:rPr>
         <w:t>Qualitätskontrolle GEAK durch</w:t>
+      </w:r>
+      <w:r>
+        <w:rPr>
+          <w:b/>
+        </w:rPr>
         <w:tab/>
         <w:t>erfolgt am:</w:t>
       </w:r>
@@ -1100,41 +828,32 @@
     <w:tbl>
       <w:tblPr>
         <w:tblW w:w="9075" w:type="dxa"/>
-        <w:jc w:val="left"/>
-        <w:tblInd w:w="0" w:type="dxa"/>
         <w:tblLayout w:type="fixed"/>
         <w:tblCellMar>
-          <w:top w:w="0" w:type="dxa"/>
           <w:left w:w="0" w:type="dxa"/>
-          <w:bottom w:w="0" w:type="dxa"/>
           <w:right w:w="0" w:type="dxa"/>
         </w:tblCellMar>
-        <w:tblLook w:val="04a0" w:noHBand="0" w:noVBand="1" w:firstColumn="1" w:lastRow="0" w:lastColumn="0" w:firstRow="1"/>
+        <w:tblLook w:val="04A0" w:firstRow="1" w:lastRow="0" w:firstColumn="1" w:lastColumn="0" w:noHBand="0" w:noVBand="1"/>
       </w:tblPr>
       <w:tblGrid>
-        <w:gridCol w:w="6936"/>
+        <w:gridCol w:w="6937"/>
         <w:gridCol w:w="2138"/>
       </w:tblGrid>
       <w:tr>
         <w:trPr>
-          <w:tblHeader w:val="true"/>
+          <w:tblHeader/>
         </w:trPr>
         <w:tc>
           <w:tcPr>
             <w:tcW w:w="6936" w:type="dxa"/>
-            <w:tcBorders/>
-            <w:shd w:color="auto" w:fill="auto" w:val="clear"/>
+            <w:shd w:val="clear" w:color="auto" w:fill="auto"/>
           </w:tcPr>
           <w:p>
             <w:pPr>
               <w:pStyle w:val="TableContents"/>
-              <w:widowControl w:val="false"/>
-              <w:rPr>
-                <w:rFonts w:ascii="Arial" w:hAnsi="Arial"/>
-              </w:rPr>
-            </w:pPr>
-            <w:r>
-              <w:rPr/>
+              <w:widowControl w:val="0"/>
+            </w:pPr>
+            <w:r>
               <w:t>{%tr for FACHSTELLE in ZIRKULATION_ALLE %}</w:t>
             </w:r>
           </w:p>
@@ -1142,42 +861,29 @@
         <w:tc>
           <w:tcPr>
             <w:tcW w:w="2138" w:type="dxa"/>
-            <w:tcBorders/>
-            <w:shd w:color="auto" w:fill="auto" w:val="clear"/>
+            <w:shd w:val="clear" w:color="auto" w:fill="auto"/>
           </w:tcPr>
           <w:p>
             <w:pPr>
               <w:pStyle w:val="TableContents"/>
-              <w:widowControl w:val="false"/>
+              <w:widowControl w:val="0"/>
               <w:jc w:val="right"/>
-              <w:rPr>
-                <w:rFonts w:ascii="Arial" w:hAnsi="Arial"/>
-              </w:rPr>
-            </w:pPr>
-            <w:r>
-              <w:rPr/>
-            </w:r>
+            </w:pPr>
           </w:p>
         </w:tc>
       </w:tr>
       <w:tr>
-        <w:trPr/>
         <w:tc>
           <w:tcPr>
             <w:tcW w:w="6936" w:type="dxa"/>
-            <w:tcBorders/>
-            <w:shd w:color="auto" w:fill="auto" w:val="clear"/>
+            <w:shd w:val="clear" w:color="auto" w:fill="auto"/>
           </w:tcPr>
           <w:p>
             <w:pPr>
               <w:pStyle w:val="TableContents"/>
-              <w:widowControl w:val="false"/>
-              <w:rPr>
-                <w:rFonts w:ascii="Arial" w:hAnsi="Arial"/>
-              </w:rPr>
-            </w:pPr>
-            <w:r>
-              <w:rPr/>
+              <w:widowControl w:val="0"/>
+            </w:pPr>
+            <w:r>
               <w:t>{{FACHSTELLE.NAME}}</w:t>
             </w:r>
           </w:p>
@@ -1185,47 +891,32 @@
         <w:tc>
           <w:tcPr>
             <w:tcW w:w="2138" w:type="dxa"/>
-            <w:tcBorders/>
-            <w:shd w:color="auto" w:fill="auto" w:val="clear"/>
+            <w:shd w:val="clear" w:color="auto" w:fill="auto"/>
           </w:tcPr>
           <w:p>
             <w:pPr>
               <w:pStyle w:val="TableContents"/>
-              <w:widowControl w:val="false"/>
+              <w:widowControl w:val="0"/>
               <w:jc w:val="right"/>
-              <w:rPr>
-                <w:rFonts w:ascii="Arial" w:hAnsi="Arial"/>
-                <w:highlight w:val="none"/>
-                <w:shd w:fill="auto" w:val="clear"/>
-              </w:rPr>
-            </w:pPr>
-            <w:r>
-              <w:rPr>
-                <w:shd w:fill="auto" w:val="clear"/>
-              </w:rPr>
+            </w:pPr>
+            <w:r>
               <w:t>{{FACHSTELLE.BEANTWORTET}}</w:t>
             </w:r>
           </w:p>
         </w:tc>
       </w:tr>
       <w:tr>
-        <w:trPr/>
         <w:tc>
           <w:tcPr>
             <w:tcW w:w="6936" w:type="dxa"/>
-            <w:tcBorders/>
-            <w:shd w:color="auto" w:fill="auto" w:val="clear"/>
+            <w:shd w:val="clear" w:color="auto" w:fill="auto"/>
           </w:tcPr>
           <w:p>
             <w:pPr>
               <w:pStyle w:val="TableContents"/>
-              <w:widowControl w:val="false"/>
-              <w:rPr>
-                <w:rFonts w:ascii="Arial" w:hAnsi="Arial"/>
-              </w:rPr>
-            </w:pPr>
-            <w:r>
-              <w:rPr/>
+              <w:widowControl w:val="0"/>
+            </w:pPr>
+            <w:r>
               <w:t>{%tr endfor %}</w:t>
             </w:r>
           </w:p>
@@ -1233,59 +924,46 @@
         <w:tc>
           <w:tcPr>
             <w:tcW w:w="2138" w:type="dxa"/>
-            <w:tcBorders/>
-            <w:shd w:color="auto" w:fill="auto" w:val="clear"/>
+            <w:shd w:val="clear" w:color="auto" w:fill="auto"/>
           </w:tcPr>
           <w:p>
             <w:pPr>
               <w:pStyle w:val="TableContents"/>
-              <w:widowControl w:val="false"/>
+              <w:widowControl w:val="0"/>
               <w:jc w:val="right"/>
-              <w:rPr>
-                <w:rFonts w:ascii="Arial" w:hAnsi="Arial"/>
-              </w:rPr>
-            </w:pPr>
-            <w:r>
-              <w:rPr/>
-            </w:r>
+            </w:pPr>
           </w:p>
         </w:tc>
       </w:tr>
     </w:tbl>
     <w:p>
       <w:pPr>
-        <w:pStyle w:val="Normal"/>
-        <w:tabs>
-          <w:tab w:val="clear" w:pos="708"/>
-          <w:tab w:val="right" w:pos="9070" w:leader="none"/>
-        </w:tabs>
-        <w:spacing w:lineRule="exact" w:line="280"/>
-        <w:rPr>
-          <w:rFonts w:ascii="Arial" w:hAnsi="Arial"/>
-        </w:rPr>
+        <w:tabs>
+          <w:tab w:val="right" w:pos="9070"/>
+        </w:tabs>
+        <w:spacing w:line="280" w:lineRule="exact"/>
       </w:pPr>
       <w:r>
-        <w:rPr/>
         <w:t>{% endif %}</w:t>
       </w:r>
     </w:p>
     <w:p>
       <w:pPr>
-        <w:pStyle w:val="Normal"/>
-        <w:tabs>
-          <w:tab w:val="clear" w:pos="708"/>
-          <w:tab w:val="right" w:pos="9070" w:leader="none"/>
-        </w:tabs>
-        <w:spacing w:lineRule="exact" w:line="280"/>
-        <w:rPr>
-          <w:rFonts w:ascii="Arial" w:hAnsi="Arial"/>
-        </w:rPr>
+        <w:tabs>
+          <w:tab w:val="right" w:pos="9070"/>
+        </w:tabs>
+        <w:spacing w:line="280" w:lineRule="exact"/>
       </w:pPr>
       <w:r>
         <w:rPr>
           <w:b/>
         </w:rPr>
         <w:t>Zeitstempel</w:t>
+      </w:r>
+      <w:r>
+        <w:rPr>
+          <w:b/>
+        </w:rPr>
         <w:tab/>
         <w:t>Datum:</w:t>
       </w:r>
@@ -1293,48 +971,33 @@
     <w:tbl>
       <w:tblPr>
         <w:tblW w:w="9322" w:type="dxa"/>
-        <w:jc w:val="left"/>
-        <w:tblInd w:w="0" w:type="dxa"/>
         <w:tblLayout w:type="fixed"/>
-        <w:tblCellMar>
-          <w:top w:w="0" w:type="dxa"/>
-          <w:left w:w="108" w:type="dxa"/>
-          <w:bottom w:w="0" w:type="dxa"/>
-          <w:right w:w="108" w:type="dxa"/>
-        </w:tblCellMar>
-        <w:tblLook w:val="01e0" w:noHBand="0" w:noVBand="0" w:firstColumn="1" w:lastRow="1" w:lastColumn="1" w:firstRow="1"/>
+        <w:tblLook w:val="01E0" w:firstRow="1" w:lastRow="1" w:firstColumn="1" w:lastColumn="1" w:noHBand="0" w:noVBand="0"/>
       </w:tblPr>
       <w:tblGrid>
-        <w:gridCol w:w="7019"/>
+        <w:gridCol w:w="7020"/>
         <w:gridCol w:w="2302"/>
       </w:tblGrid>
       <w:tr>
         <w:trPr>
-          <w:trHeight w:val="58" w:hRule="atLeast"/>
+          <w:trHeight w:val="58"/>
         </w:trPr>
         <w:tc>
           <w:tcPr>
             <w:tcW w:w="7019" w:type="dxa"/>
-            <w:tcBorders/>
-            <w:shd w:color="auto" w:fill="auto" w:val="clear"/>
-          </w:tcPr>
-          <w:p>
-            <w:pPr>
-              <w:pStyle w:val="Normal"/>
-              <w:widowControl w:val="false"/>
+            <w:shd w:val="clear" w:color="auto" w:fill="auto"/>
+          </w:tcPr>
+          <w:p>
+            <w:pPr>
+              <w:widowControl w:val="0"/>
               <w:tabs>
-                <w:tab w:val="clear" w:pos="708"/>
-                <w:tab w:val="left" w:pos="284" w:leader="none"/>
-                <w:tab w:val="left" w:pos="5387" w:leader="none"/>
-                <w:tab w:val="right" w:pos="9070" w:leader="none"/>
+                <w:tab w:val="left" w:pos="284"/>
+                <w:tab w:val="left" w:pos="5387"/>
+                <w:tab w:val="right" w:pos="9070"/>
               </w:tabs>
-              <w:spacing w:lineRule="exact" w:line="280" w:before="120" w:after="0"/>
-              <w:rPr>
-                <w:rFonts w:ascii="Arial" w:hAnsi="Arial"/>
-              </w:rPr>
-            </w:pPr>
-            <w:r>
-              <w:rPr/>
+              <w:spacing w:before="120" w:line="280" w:lineRule="exact"/>
+            </w:pPr>
+            <w:r>
               <w:t>Bestätigung erfolgt per</w:t>
             </w:r>
           </w:p>
@@ -1342,21 +1005,17 @@
         <w:tc>
           <w:tcPr>
             <w:tcW w:w="2302" w:type="dxa"/>
-            <w:tcBorders/>
-            <w:shd w:color="auto" w:fill="auto" w:val="clear"/>
-          </w:tcPr>
-          <w:p>
-            <w:pPr>
-              <w:pStyle w:val="Normal"/>
-              <w:widowControl w:val="false"/>
+            <w:shd w:val="clear" w:color="auto" w:fill="auto"/>
+          </w:tcPr>
+          <w:p>
+            <w:pPr>
+              <w:widowControl w:val="0"/>
               <w:tabs>
-                <w:tab w:val="clear" w:pos="708"/>
-                <w:tab w:val="right" w:pos="9070" w:leader="none"/>
+                <w:tab w:val="right" w:pos="9070"/>
               </w:tabs>
-              <w:spacing w:lineRule="exact" w:line="280" w:before="120" w:after="0"/>
-              <w:ind w:right="34" w:hanging="0"/>
+              <w:spacing w:before="120" w:line="280" w:lineRule="exact"/>
+              <w:ind w:right="34"/>
               <w:jc w:val="right"/>
-              <w:rPr/>
             </w:pPr>
             <w:r>
               <w:rPr>
@@ -1370,57 +1029,61 @@
     </w:tbl>
     <w:p>
       <w:pPr>
-        <w:pStyle w:val="Normal"/>
-        <w:spacing w:lineRule="exact" w:line="280"/>
-        <w:rPr>
-          <w:rFonts w:ascii="Arial" w:hAnsi="Arial"/>
-        </w:rPr>
-      </w:pPr>
-      <w:r>
-        <w:rPr/>
-      </w:r>
+        <w:spacing w:line="280" w:lineRule="exact"/>
+      </w:pPr>
     </w:p>
     <w:sectPr>
-      <w:headerReference w:type="default" r:id="rId2"/>
-      <w:footerReference w:type="first" r:id="rId3"/>
-      <w:type w:val="nextPage"/>
+      <w:headerReference w:type="default" r:id="rId11"/>
+      <w:footerReference w:type="first" r:id="rId12"/>
       <w:pgSz w:w="11906" w:h="16838"/>
-      <w:pgMar w:left="1418" w:right="1418" w:gutter="0" w:header="454" w:top="511" w:footer="851" w:bottom="1474"/>
-      <w:pgNumType w:fmt="decimal"/>
-      <w:formProt w:val="false"/>
+      <w:pgMar w:top="511" w:right="1418" w:bottom="1474" w:left="1418" w:header="454" w:footer="851" w:gutter="0"/>
+      <w:cols w:space="720"/>
+      <w:formProt w:val="0"/>
       <w:titlePg/>
-      <w:textDirection w:val="lrTb"/>
-      <w:docGrid w:type="default" w:linePitch="328" w:charSpace="9830"/>
+      <w:docGrid w:linePitch="328" w:charSpace="9830"/>
     </w:sectPr>
   </w:body>
 </w:document>
 </file>
 
+<file path=word/endnotes.xml><?xml version="1.0" encoding="utf-8"?>
+<w:endnotes xmlns:wpc="http://schemas.microsoft.com/office/word/2010/wordprocessingCanvas" xmlns:cx="http://schemas.microsoft.com/office/drawing/2014/chartex" xmlns:cx1="http://schemas.microsoft.com/office/drawing/2015/9/8/chartex" xmlns:cx2="http://schemas.microsoft.com/office/drawing/2015/10/21/chartex" xmlns:cx3="http://schemas.microsoft.com/office/drawing/2016/5/9/chartex" xmlns:cx4="http://schemas.microsoft.com/office/drawing/2016/5/10/chartex" xmlns:cx5="http://schemas.microsoft.com/office/drawing/2016/5/11/chartex" xmlns:cx6="http://schemas.microsoft.com/office/drawing/2016/5/12/chartex" xmlns:cx7="http://schemas.microsoft.com/office/drawing/2016/5/13/chartex" xmlns:cx8="http://schemas.microsoft.com/office/drawing/2016/5/14/chartex" xmlns:mc="http://schemas.openxmlformats.org/markup-compatibility/2006" xmlns:aink="http://schemas.microsoft.com/office/drawing/2016/ink" xmlns:am3d="http://schemas.microsoft.com/office/drawing/2017/model3d" xmlns:o="urn:schemas-microsoft-com:office:office" xmlns:oel="http://schemas.microsoft.com/office/2019/extlst" xmlns:r="http://schemas.openxmlformats.org/officeDocument/2006/relationships" xmlns:m="http://schemas.openxmlformats.org/officeDocument/2006/math" xmlns:v="urn:schemas-microsoft-com:vml" xmlns:wp14="http://schemas.microsoft.com/office/word/2010/wordprocessingDrawing" xmlns:wp="http://schemas.openxmlformats.org/drawingml/2006/wordprocessingDrawing" xmlns:w10="urn:schemas-microsoft-com:office:word" xmlns:w="http://schemas.openxmlformats.org/wordprocessingml/2006/main" xmlns:w14="http://schemas.microsoft.com/office/word/2010/wordml" xmlns:w15="http://schemas.microsoft.com/office/word/2012/wordml" xmlns:w16cex="http://schemas.microsoft.com/office/word/2018/wordml/cex" xmlns:w16cid="http://schemas.microsoft.com/office/word/2016/wordml/cid" xmlns:w16="http://schemas.microsoft.com/office/word/2018/wordml" xmlns:w16sdtdh="http://schemas.microsoft.com/office/word/2020/wordml/sdtdatahash" xmlns:w16se="http://schemas.microsoft.com/office/word/2015/wordml/symex" xmlns:wpg="http://schemas.microsoft.com/office/word/2010/wordprocessingGroup" xmlns:wpi="http://schemas.microsoft.com/office/word/2010/wordprocessingInk" xmlns:wne="http://schemas.microsoft.com/office/word/2006/wordml" xmlns:wps="http://schemas.microsoft.com/office/word/2010/wordprocessingShape" mc:Ignorable="w14 w15 w16se w16cid w16 w16cex w16sdtdh wp14">
+  <w:endnote w:type="separator" w:id="-1">
+    <w:p>
+      <w:r>
+        <w:separator/>
+      </w:r>
+    </w:p>
+  </w:endnote>
+  <w:endnote w:type="continuationSeparator" w:id="0">
+    <w:p>
+      <w:r>
+        <w:continuationSeparator/>
+      </w:r>
+    </w:p>
+  </w:endnote>
+</w:endnotes>
+</file>
+
 <file path=word/footer1.xml><?xml version="1.0" encoding="utf-8"?>
-<w:ftr xmlns:o="urn:schemas-microsoft-com:office:office" xmlns:r="http://schemas.openxmlformats.org/officeDocument/2006/relationships" xmlns:v="urn:schemas-microsoft-com:vml" xmlns:w="http://schemas.openxmlformats.org/wordprocessingml/2006/main" xmlns:w10="urn:schemas-microsoft-com:office:word" xmlns:wp="http://schemas.openxmlformats.org/drawingml/2006/wordprocessingDrawing" xmlns:wps="http://schemas.microsoft.com/office/word/2010/wordprocessingShape" xmlns:wpg="http://schemas.microsoft.com/office/word/2010/wordprocessingGroup" xmlns:mc="http://schemas.openxmlformats.org/markup-compatibility/2006" xmlns:wp14="http://schemas.microsoft.com/office/word/2010/wordprocessingDrawing" xmlns:w14="http://schemas.microsoft.com/office/word/2010/wordml" xmlns:w15="http://schemas.microsoft.com/office/word/2012/wordml" mc:Ignorable="w14 wp14 w15">
+<w:ftr xmlns:wpc="http://schemas.microsoft.com/office/word/2010/wordprocessingCanvas" xmlns:cx="http://schemas.microsoft.com/office/drawing/2014/chartex" xmlns:cx1="http://schemas.microsoft.com/office/drawing/2015/9/8/chartex" xmlns:cx2="http://schemas.microsoft.com/office/drawing/2015/10/21/chartex" xmlns:cx3="http://schemas.microsoft.com/office/drawing/2016/5/9/chartex" xmlns:cx4="http://schemas.microsoft.com/office/drawing/2016/5/10/chartex" xmlns:cx5="http://schemas.microsoft.com/office/drawing/2016/5/11/chartex" xmlns:cx6="http://schemas.microsoft.com/office/drawing/2016/5/12/chartex" xmlns:cx7="http://schemas.microsoft.com/office/drawing/2016/5/13/chartex" xmlns:cx8="http://schemas.microsoft.com/office/drawing/2016/5/14/chartex" xmlns:mc="http://schemas.openxmlformats.org/markup-compatibility/2006" xmlns:aink="http://schemas.microsoft.com/office/drawing/2016/ink" xmlns:am3d="http://schemas.microsoft.com/office/drawing/2017/model3d" xmlns:o="urn:schemas-microsoft-com:office:office" xmlns:oel="http://schemas.microsoft.com/office/2019/extlst" xmlns:r="http://schemas.openxmlformats.org/officeDocument/2006/relationships" xmlns:m="http://schemas.openxmlformats.org/officeDocument/2006/math" xmlns:v="urn:schemas-microsoft-com:vml" xmlns:wp14="http://schemas.microsoft.com/office/word/2010/wordprocessingDrawing" xmlns:wp="http://schemas.openxmlformats.org/drawingml/2006/wordprocessingDrawing" xmlns:w10="urn:schemas-microsoft-com:office:word" xmlns:w="http://schemas.openxmlformats.org/wordprocessingml/2006/main" xmlns:w14="http://schemas.microsoft.com/office/word/2010/wordml" xmlns:w15="http://schemas.microsoft.com/office/word/2012/wordml" xmlns:w16cex="http://schemas.microsoft.com/office/word/2018/wordml/cex" xmlns:w16cid="http://schemas.microsoft.com/office/word/2016/wordml/cid" xmlns:w16="http://schemas.microsoft.com/office/word/2018/wordml" xmlns:w16sdtdh="http://schemas.microsoft.com/office/word/2020/wordml/sdtdatahash" xmlns:w16se="http://schemas.microsoft.com/office/word/2015/wordml/symex" xmlns:wpg="http://schemas.microsoft.com/office/word/2010/wordprocessingGroup" xmlns:wpi="http://schemas.microsoft.com/office/word/2010/wordprocessingInk" xmlns:wne="http://schemas.microsoft.com/office/word/2006/wordml" xmlns:wps="http://schemas.microsoft.com/office/word/2010/wordprocessingShape" mc:Ignorable="w14 w15 w16se w16cid w16 w16cex w16sdtdh wp14">
   <w:p>
     <w:pPr>
       <w:pStyle w:val="Fuzeile1"/>
-      <w:rPr/>
     </w:pPr>
     <w:r>
-      <w:rPr/>
       <w:fldChar w:fldCharType="begin"/>
     </w:r>
     <w:r>
-      <w:rPr/>
       <w:instrText xml:space="preserve"> FILENAME </w:instrText>
     </w:r>
     <w:r>
-      <w:rPr/>
       <w:fldChar w:fldCharType="separate"/>
     </w:r>
     <w:r>
-      <w:rPr/>
       <w:t>de-bestaetigung-waermeerzeugerersatz.docx</w:t>
     </w:r>
     <w:r>
-      <w:rPr/>
       <w:fldChar w:fldCharType="end"/>
     </w:r>
     <w:r>
@@ -1434,68 +1097,69 @@
 </w:ftr>
 </file>
 
+<file path=word/footnotes.xml><?xml version="1.0" encoding="utf-8"?>
+<w:footnotes xmlns:wpc="http://schemas.microsoft.com/office/word/2010/wordprocessingCanvas" xmlns:cx="http://schemas.microsoft.com/office/drawing/2014/chartex" xmlns:cx1="http://schemas.microsoft.com/office/drawing/2015/9/8/chartex" xmlns:cx2="http://schemas.microsoft.com/office/drawing/2015/10/21/chartex" xmlns:cx3="http://schemas.microsoft.com/office/drawing/2016/5/9/chartex" xmlns:cx4="http://schemas.microsoft.com/office/drawing/2016/5/10/chartex" xmlns:cx5="http://schemas.microsoft.com/office/drawing/2016/5/11/chartex" xmlns:cx6="http://schemas.microsoft.com/office/drawing/2016/5/12/chartex" xmlns:cx7="http://schemas.microsoft.com/office/drawing/2016/5/13/chartex" xmlns:cx8="http://schemas.microsoft.com/office/drawing/2016/5/14/chartex" xmlns:mc="http://schemas.openxmlformats.org/markup-compatibility/2006" xmlns:aink="http://schemas.microsoft.com/office/drawing/2016/ink" xmlns:am3d="http://schemas.microsoft.com/office/drawing/2017/model3d" xmlns:o="urn:schemas-microsoft-com:office:office" xmlns:oel="http://schemas.microsoft.com/office/2019/extlst" xmlns:r="http://schemas.openxmlformats.org/officeDocument/2006/relationships" xmlns:m="http://schemas.openxmlformats.org/officeDocument/2006/math" xmlns:v="urn:schemas-microsoft-com:vml" xmlns:wp14="http://schemas.microsoft.com/office/word/2010/wordprocessingDrawing" xmlns:wp="http://schemas.openxmlformats.org/drawingml/2006/wordprocessingDrawing" xmlns:w10="urn:schemas-microsoft-com:office:word" xmlns:w="http://schemas.openxmlformats.org/wordprocessingml/2006/main" xmlns:w14="http://schemas.microsoft.com/office/word/2010/wordml" xmlns:w15="http://schemas.microsoft.com/office/word/2012/wordml" xmlns:w16cex="http://schemas.microsoft.com/office/word/2018/wordml/cex" xmlns:w16cid="http://schemas.microsoft.com/office/word/2016/wordml/cid" xmlns:w16="http://schemas.microsoft.com/office/word/2018/wordml" xmlns:w16sdtdh="http://schemas.microsoft.com/office/word/2020/wordml/sdtdatahash" xmlns:w16se="http://schemas.microsoft.com/office/word/2015/wordml/symex" xmlns:wpg="http://schemas.microsoft.com/office/word/2010/wordprocessingGroup" xmlns:wpi="http://schemas.microsoft.com/office/word/2010/wordprocessingInk" xmlns:wne="http://schemas.microsoft.com/office/word/2006/wordml" xmlns:wps="http://schemas.microsoft.com/office/word/2010/wordprocessingShape" mc:Ignorable="w14 w15 w16se w16cid w16 w16cex w16sdtdh wp14">
+  <w:footnote w:type="separator" w:id="-1">
+    <w:p>
+      <w:r>
+        <w:separator/>
+      </w:r>
+    </w:p>
+  </w:footnote>
+  <w:footnote w:type="continuationSeparator" w:id="0">
+    <w:p>
+      <w:r>
+        <w:continuationSeparator/>
+      </w:r>
+    </w:p>
+  </w:footnote>
+</w:footnotes>
+</file>
+
 <file path=word/header1.xml><?xml version="1.0" encoding="utf-8"?>
-<w:hdr xmlns:o="urn:schemas-microsoft-com:office:office" xmlns:r="http://schemas.openxmlformats.org/officeDocument/2006/relationships" xmlns:v="urn:schemas-microsoft-com:vml" xmlns:w="http://schemas.openxmlformats.org/wordprocessingml/2006/main" xmlns:w10="urn:schemas-microsoft-com:office:word" xmlns:wp="http://schemas.openxmlformats.org/drawingml/2006/wordprocessingDrawing" xmlns:wps="http://schemas.microsoft.com/office/word/2010/wordprocessingShape" xmlns:wpg="http://schemas.microsoft.com/office/word/2010/wordprocessingGroup" xmlns:mc="http://schemas.openxmlformats.org/markup-compatibility/2006" xmlns:wp14="http://schemas.microsoft.com/office/word/2010/wordprocessingDrawing" xmlns:w14="http://schemas.microsoft.com/office/word/2010/wordml" xmlns:w15="http://schemas.microsoft.com/office/word/2012/wordml" mc:Ignorable="w14 wp14 w15">
+<w:hdr xmlns:wpc="http://schemas.microsoft.com/office/word/2010/wordprocessingCanvas" xmlns:cx="http://schemas.microsoft.com/office/drawing/2014/chartex" xmlns:cx1="http://schemas.microsoft.com/office/drawing/2015/9/8/chartex" xmlns:cx2="http://schemas.microsoft.com/office/drawing/2015/10/21/chartex" xmlns:cx3="http://schemas.microsoft.com/office/drawing/2016/5/9/chartex" xmlns:cx4="http://schemas.microsoft.com/office/drawing/2016/5/10/chartex" xmlns:cx5="http://schemas.microsoft.com/office/drawing/2016/5/11/chartex" xmlns:cx6="http://schemas.microsoft.com/office/drawing/2016/5/12/chartex" xmlns:cx7="http://schemas.microsoft.com/office/drawing/2016/5/13/chartex" xmlns:cx8="http://schemas.microsoft.com/office/drawing/2016/5/14/chartex" xmlns:mc="http://schemas.openxmlformats.org/markup-compatibility/2006" xmlns:aink="http://schemas.microsoft.com/office/drawing/2016/ink" xmlns:am3d="http://schemas.microsoft.com/office/drawing/2017/model3d" xmlns:o="urn:schemas-microsoft-com:office:office" xmlns:oel="http://schemas.microsoft.com/office/2019/extlst" xmlns:r="http://schemas.openxmlformats.org/officeDocument/2006/relationships" xmlns:m="http://schemas.openxmlformats.org/officeDocument/2006/math" xmlns:v="urn:schemas-microsoft-com:vml" xmlns:wp14="http://schemas.microsoft.com/office/word/2010/wordprocessingDrawing" xmlns:wp="http://schemas.openxmlformats.org/drawingml/2006/wordprocessingDrawing" xmlns:w10="urn:schemas-microsoft-com:office:word" xmlns:w="http://schemas.openxmlformats.org/wordprocessingml/2006/main" xmlns:w14="http://schemas.microsoft.com/office/word/2010/wordml" xmlns:w15="http://schemas.microsoft.com/office/word/2012/wordml" xmlns:w16cex="http://schemas.microsoft.com/office/word/2018/wordml/cex" xmlns:w16cid="http://schemas.microsoft.com/office/word/2016/wordml/cid" xmlns:w16="http://schemas.microsoft.com/office/word/2018/wordml" xmlns:w16sdtdh="http://schemas.microsoft.com/office/word/2020/wordml/sdtdatahash" xmlns:w16se="http://schemas.microsoft.com/office/word/2015/wordml/symex" xmlns:wpg="http://schemas.microsoft.com/office/word/2010/wordprocessingGroup" xmlns:wpi="http://schemas.microsoft.com/office/word/2010/wordprocessingInk" xmlns:wne="http://schemas.microsoft.com/office/word/2006/wordml" xmlns:wps="http://schemas.microsoft.com/office/word/2010/wordprocessingShape" mc:Ignorable="w14 w15 w16se w16cid w16 w16cex w16sdtdh wp14">
   <w:p>
     <w:pPr>
       <w:pStyle w:val="Fuzeile1"/>
       <w:tabs>
-        <w:tab w:val="center" w:pos="4536" w:leader="none"/>
-        <w:tab w:val="right" w:pos="8505" w:leader="none"/>
-        <w:tab w:val="right" w:pos="9072" w:leader="none"/>
+        <w:tab w:val="right" w:pos="8505"/>
       </w:tabs>
       <w:rPr>
         <w:lang w:eastAsia="de-DE"/>
       </w:rPr>
     </w:pPr>
-    <w:r>
-      <w:rPr>
-        <w:lang w:eastAsia="de-DE"/>
-      </w:rPr>
-    </w:r>
   </w:p>
   <w:p>
     <w:pPr>
       <w:pStyle w:val="Fuzeile1"/>
       <w:tabs>
-        <w:tab w:val="center" w:pos="4536" w:leader="none"/>
-        <w:tab w:val="right" w:pos="8505" w:leader="none"/>
-        <w:tab w:val="right" w:pos="9072" w:leader="none"/>
+        <w:tab w:val="right" w:pos="8505"/>
       </w:tabs>
       <w:rPr>
         <w:lang w:eastAsia="de-DE"/>
       </w:rPr>
     </w:pPr>
-    <w:r>
-      <w:rPr>
-        <w:lang w:eastAsia="de-DE"/>
-      </w:rPr>
-    </w:r>
   </w:p>
   <w:p>
     <w:pPr>
       <w:pStyle w:val="Fuzeile1"/>
       <w:tabs>
-        <w:tab w:val="center" w:pos="4536" w:leader="none"/>
-        <w:tab w:val="right" w:pos="8505" w:leader="none"/>
-        <w:tab w:val="right" w:pos="9072" w:leader="none"/>
+        <w:tab w:val="right" w:pos="8505"/>
       </w:tabs>
       <w:rPr>
         <w:lang w:eastAsia="de-DE"/>
       </w:rPr>
     </w:pPr>
-    <w:r>
-      <w:rPr>
-        <w:lang w:eastAsia="de-DE"/>
-      </w:rPr>
-    </w:r>
   </w:p>
 </w:hdr>
 </file>
 
 <file path=word/numbering.xml><?xml version="1.0" encoding="utf-8"?>
-<w:numbering xmlns:w="http://schemas.openxmlformats.org/wordprocessingml/2006/main" xmlns:o="urn:schemas-microsoft-com:office:office" xmlns:r="http://schemas.openxmlformats.org/officeDocument/2006/relationships" xmlns:v="urn:schemas-microsoft-com:vml" xmlns:mc="http://schemas.openxmlformats.org/markup-compatibility/2006" xmlns:w14="http://schemas.microsoft.com/office/word/2010/wordml" mc:Ignorable="w14">
-  <w:abstractNum w:abstractNumId="1">
+<w:numbering xmlns:wpc="http://schemas.microsoft.com/office/word/2010/wordprocessingCanvas" xmlns:cx="http://schemas.microsoft.com/office/drawing/2014/chartex" xmlns:cx1="http://schemas.microsoft.com/office/drawing/2015/9/8/chartex" xmlns:cx2="http://schemas.microsoft.com/office/drawing/2015/10/21/chartex" xmlns:cx3="http://schemas.microsoft.com/office/drawing/2016/5/9/chartex" xmlns:cx4="http://schemas.microsoft.com/office/drawing/2016/5/10/chartex" xmlns:cx5="http://schemas.microsoft.com/office/drawing/2016/5/11/chartex" xmlns:cx6="http://schemas.microsoft.com/office/drawing/2016/5/12/chartex" xmlns:cx7="http://schemas.microsoft.com/office/drawing/2016/5/13/chartex" xmlns:cx8="http://schemas.microsoft.com/office/drawing/2016/5/14/chartex" xmlns:mc="http://schemas.openxmlformats.org/markup-compatibility/2006" xmlns:aink="http://schemas.microsoft.com/office/drawing/2016/ink" xmlns:am3d="http://schemas.microsoft.com/office/drawing/2017/model3d" xmlns:o="urn:schemas-microsoft-com:office:office" xmlns:oel="http://schemas.microsoft.com/office/2019/extlst" xmlns:r="http://schemas.openxmlformats.org/officeDocument/2006/relationships" xmlns:m="http://schemas.openxmlformats.org/officeDocument/2006/math" xmlns:v="urn:schemas-microsoft-com:vml" xmlns:wp14="http://schemas.microsoft.com/office/word/2010/wordprocessingDrawing" xmlns:wp="http://schemas.openxmlformats.org/drawingml/2006/wordprocessingDrawing" xmlns:w10="urn:schemas-microsoft-com:office:word" xmlns:w="http://schemas.openxmlformats.org/wordprocessingml/2006/main" xmlns:w14="http://schemas.microsoft.com/office/word/2010/wordml" xmlns:w15="http://schemas.microsoft.com/office/word/2012/wordml" xmlns:w16cex="http://schemas.microsoft.com/office/word/2018/wordml/cex" xmlns:w16cid="http://schemas.microsoft.com/office/word/2016/wordml/cid" xmlns:w16="http://schemas.microsoft.com/office/word/2018/wordml" xmlns:w16sdtdh="http://schemas.microsoft.com/office/word/2020/wordml/sdtdatahash" xmlns:w16se="http://schemas.microsoft.com/office/word/2015/wordml/symex" xmlns:wpg="http://schemas.microsoft.com/office/word/2010/wordprocessingGroup" xmlns:wpi="http://schemas.microsoft.com/office/word/2010/wordprocessingInk" xmlns:wne="http://schemas.microsoft.com/office/word/2006/wordml" xmlns:wps="http://schemas.microsoft.com/office/word/2010/wordprocessingShape" mc:Ignorable="w14 w15 w16se w16cid w16 w16cex w16sdtdh wp14">
+  <w:abstractNum w:abstractNumId="0" w15:restartNumberingAfterBreak="0">
+    <w:nsid w:val="41900174"/>
+    <w:multiLevelType w:val="multilevel"/>
+    <w:tmpl w:val="D12631FE"/>
     <w:lvl w:ilvl="0">
       <w:start w:val="1"/>
       <w:numFmt w:val="bullet"/>
@@ -1632,7 +1296,10 @@
       </w:rPr>
     </w:lvl>
   </w:abstractNum>
-  <w:abstractNum w:abstractNumId="2">
+  <w:abstractNum w:abstractNumId="1" w15:restartNumberingAfterBreak="0">
+    <w:nsid w:val="43426B6F"/>
+    <w:multiLevelType w:val="multilevel"/>
+    <w:tmpl w:val="8414867E"/>
     <w:lvl w:ilvl="0">
       <w:start w:val="1"/>
       <w:numFmt w:val="none"/>
@@ -1643,7 +1310,7 @@
         <w:tabs>
           <w:tab w:val="num" w:pos="0"/>
         </w:tabs>
-        <w:ind w:left="0" w:hanging="0"/>
+        <w:ind w:left="0" w:firstLine="0"/>
       </w:pPr>
     </w:lvl>
     <w:lvl w:ilvl="1">
@@ -1656,7 +1323,7 @@
         <w:tabs>
           <w:tab w:val="num" w:pos="0"/>
         </w:tabs>
-        <w:ind w:left="0" w:hanging="0"/>
+        <w:ind w:left="0" w:firstLine="0"/>
       </w:pPr>
     </w:lvl>
     <w:lvl w:ilvl="2">
@@ -1669,7 +1336,7 @@
         <w:tabs>
           <w:tab w:val="num" w:pos="0"/>
         </w:tabs>
-        <w:ind w:left="0" w:hanging="0"/>
+        <w:ind w:left="0" w:firstLine="0"/>
       </w:pPr>
     </w:lvl>
     <w:lvl w:ilvl="3">
@@ -1682,7 +1349,7 @@
         <w:tabs>
           <w:tab w:val="num" w:pos="0"/>
         </w:tabs>
-        <w:ind w:left="0" w:hanging="0"/>
+        <w:ind w:left="0" w:firstLine="0"/>
       </w:pPr>
     </w:lvl>
     <w:lvl w:ilvl="4">
@@ -1695,7 +1362,7 @@
         <w:tabs>
           <w:tab w:val="num" w:pos="0"/>
         </w:tabs>
-        <w:ind w:left="0" w:hanging="0"/>
+        <w:ind w:left="0" w:firstLine="0"/>
       </w:pPr>
     </w:lvl>
     <w:lvl w:ilvl="5">
@@ -1708,7 +1375,7 @@
         <w:tabs>
           <w:tab w:val="num" w:pos="0"/>
         </w:tabs>
-        <w:ind w:left="0" w:hanging="0"/>
+        <w:ind w:left="0" w:firstLine="0"/>
       </w:pPr>
     </w:lvl>
     <w:lvl w:ilvl="6">
@@ -1721,7 +1388,7 @@
         <w:tabs>
           <w:tab w:val="num" w:pos="0"/>
         </w:tabs>
-        <w:ind w:left="0" w:hanging="0"/>
+        <w:ind w:left="0" w:firstLine="0"/>
       </w:pPr>
     </w:lvl>
     <w:lvl w:ilvl="7">
@@ -1734,7 +1401,7 @@
         <w:tabs>
           <w:tab w:val="num" w:pos="0"/>
         </w:tabs>
-        <w:ind w:left="0" w:hanging="0"/>
+        <w:ind w:left="0" w:firstLine="0"/>
       </w:pPr>
     </w:lvl>
     <w:lvl w:ilvl="8">
@@ -1747,46 +1414,46 @@
         <w:tabs>
           <w:tab w:val="num" w:pos="0"/>
         </w:tabs>
-        <w:ind w:left="0" w:hanging="0"/>
+        <w:ind w:left="0" w:firstLine="0"/>
       </w:pPr>
     </w:lvl>
   </w:abstractNum>
-  <w:num w:numId="1">
+  <w:num w:numId="1" w16cid:durableId="1344937984">
+    <w:abstractNumId w:val="0"/>
+  </w:num>
+  <w:num w:numId="2" w16cid:durableId="1831556797">
     <w:abstractNumId w:val="1"/>
-  </w:num>
-  <w:num w:numId="2">
-    <w:abstractNumId w:val="2"/>
   </w:num>
 </w:numbering>
 </file>
 
 <file path=word/styles.xml><?xml version="1.0" encoding="utf-8"?>
-<w:styles xmlns:w="http://schemas.openxmlformats.org/wordprocessingml/2006/main" xmlns:w14="http://schemas.microsoft.com/office/word/2010/wordml" xmlns:mc="http://schemas.openxmlformats.org/markup-compatibility/2006" mc:Ignorable="w14">
+<w:styles xmlns:mc="http://schemas.openxmlformats.org/markup-compatibility/2006" xmlns:r="http://schemas.openxmlformats.org/officeDocument/2006/relationships" xmlns:w="http://schemas.openxmlformats.org/wordprocessingml/2006/main" xmlns:w14="http://schemas.microsoft.com/office/word/2010/wordml" xmlns:w15="http://schemas.microsoft.com/office/word/2012/wordml" xmlns:w16cex="http://schemas.microsoft.com/office/word/2018/wordml/cex" xmlns:w16cid="http://schemas.microsoft.com/office/word/2016/wordml/cid" xmlns:w16="http://schemas.microsoft.com/office/word/2018/wordml" xmlns:w16sdtdh="http://schemas.microsoft.com/office/word/2020/wordml/sdtdatahash" xmlns:w16se="http://schemas.microsoft.com/office/word/2015/wordml/symex" mc:Ignorable="w14 w15 w16se w16cid w16 w16cex w16sdtdh">
   <w:docDefaults>
     <w:rPrDefault>
       <w:rPr>
-        <w:rFonts w:ascii="Calibri" w:hAnsi="Calibri" w:eastAsia="Calibri" w:cs="" w:asciiTheme="minorHAnsi" w:cstheme="minorBidi" w:eastAsiaTheme="minorHAnsi" w:hAnsiTheme="minorHAnsi"/>
+        <w:rFonts w:asciiTheme="minorHAnsi" w:eastAsiaTheme="minorHAnsi" w:hAnsiTheme="minorHAnsi" w:cstheme="minorBidi"/>
         <w:szCs w:val="22"/>
         <w:lang w:val="de-CH" w:eastAsia="en-US" w:bidi="ar-SA"/>
       </w:rPr>
     </w:rPrDefault>
     <w:pPrDefault>
       <w:pPr>
-        <w:suppressAutoHyphens w:val="true"/>
+        <w:suppressAutoHyphens/>
       </w:pPr>
     </w:pPrDefault>
   </w:docDefaults>
-  <w:latentStyles w:defLockedState="0" w:defUIPriority="99" w:defSemiHidden="0" w:defUnhideWhenUsed="0" w:defQFormat="0" w:count="371">
+  <w:latentStyles w:defLockedState="0" w:defUIPriority="99" w:defSemiHidden="0" w:defUnhideWhenUsed="0" w:defQFormat="0" w:count="376">
     <w:lsdException w:name="Normal" w:uiPriority="0" w:qFormat="1"/>
     <w:lsdException w:name="heading 1" w:uiPriority="9" w:qFormat="1"/>
-    <w:lsdException w:name="heading 2" w:uiPriority="9" w:semiHidden="1" w:unhideWhenUsed="1" w:qFormat="1"/>
-    <w:lsdException w:name="heading 3" w:uiPriority="9" w:semiHidden="1" w:unhideWhenUsed="1" w:qFormat="1"/>
-    <w:lsdException w:name="heading 4" w:uiPriority="9" w:semiHidden="1" w:unhideWhenUsed="1" w:qFormat="1"/>
-    <w:lsdException w:name="heading 5" w:uiPriority="9" w:semiHidden="1" w:unhideWhenUsed="1" w:qFormat="1"/>
-    <w:lsdException w:name="heading 6" w:uiPriority="9" w:semiHidden="1" w:unhideWhenUsed="1" w:qFormat="1"/>
-    <w:lsdException w:name="heading 7" w:uiPriority="9" w:semiHidden="1" w:unhideWhenUsed="1" w:qFormat="1"/>
-    <w:lsdException w:name="heading 8" w:uiPriority="9" w:semiHidden="1" w:unhideWhenUsed="1" w:qFormat="1"/>
-    <w:lsdException w:name="heading 9" w:uiPriority="9" w:semiHidden="1" w:unhideWhenUsed="1" w:qFormat="1"/>
+    <w:lsdException w:name="heading 2" w:semiHidden="1" w:uiPriority="9" w:unhideWhenUsed="1" w:qFormat="1"/>
+    <w:lsdException w:name="heading 3" w:semiHidden="1" w:uiPriority="9" w:unhideWhenUsed="1" w:qFormat="1"/>
+    <w:lsdException w:name="heading 4" w:semiHidden="1" w:uiPriority="9" w:unhideWhenUsed="1" w:qFormat="1"/>
+    <w:lsdException w:name="heading 5" w:semiHidden="1" w:uiPriority="9" w:unhideWhenUsed="1" w:qFormat="1"/>
+    <w:lsdException w:name="heading 6" w:semiHidden="1" w:uiPriority="9" w:unhideWhenUsed="1" w:qFormat="1"/>
+    <w:lsdException w:name="heading 7" w:semiHidden="1" w:uiPriority="9" w:unhideWhenUsed="1" w:qFormat="1"/>
+    <w:lsdException w:name="heading 8" w:semiHidden="1" w:uiPriority="9" w:unhideWhenUsed="1" w:qFormat="1"/>
+    <w:lsdException w:name="heading 9" w:semiHidden="1" w:uiPriority="9" w:unhideWhenUsed="1" w:qFormat="1"/>
     <w:lsdException w:name="index 1" w:semiHidden="1" w:unhideWhenUsed="1"/>
     <w:lsdException w:name="index 2" w:semiHidden="1" w:unhideWhenUsed="1"/>
     <w:lsdException w:name="index 3" w:semiHidden="1" w:unhideWhenUsed="1"/>
@@ -1796,22 +1463,22 @@
     <w:lsdException w:name="index 7" w:semiHidden="1" w:unhideWhenUsed="1"/>
     <w:lsdException w:name="index 8" w:semiHidden="1" w:unhideWhenUsed="1"/>
     <w:lsdException w:name="index 9" w:semiHidden="1" w:unhideWhenUsed="1"/>
-    <w:lsdException w:name="toc 1" w:uiPriority="39" w:semiHidden="1" w:unhideWhenUsed="1"/>
-    <w:lsdException w:name="toc 2" w:uiPriority="39" w:semiHidden="1" w:unhideWhenUsed="1"/>
-    <w:lsdException w:name="toc 3" w:uiPriority="39" w:semiHidden="1" w:unhideWhenUsed="1"/>
-    <w:lsdException w:name="toc 4" w:uiPriority="39" w:semiHidden="1" w:unhideWhenUsed="1"/>
-    <w:lsdException w:name="toc 5" w:uiPriority="39" w:semiHidden="1" w:unhideWhenUsed="1"/>
-    <w:lsdException w:name="toc 6" w:uiPriority="39" w:semiHidden="1" w:unhideWhenUsed="1"/>
-    <w:lsdException w:name="toc 7" w:uiPriority="39" w:semiHidden="1" w:unhideWhenUsed="1"/>
-    <w:lsdException w:name="toc 8" w:uiPriority="39" w:semiHidden="1" w:unhideWhenUsed="1"/>
-    <w:lsdException w:name="toc 9" w:uiPriority="39" w:semiHidden="1" w:unhideWhenUsed="1"/>
+    <w:lsdException w:name="toc 1" w:semiHidden="1" w:uiPriority="39" w:unhideWhenUsed="1"/>
+    <w:lsdException w:name="toc 2" w:semiHidden="1" w:uiPriority="39" w:unhideWhenUsed="1"/>
+    <w:lsdException w:name="toc 3" w:semiHidden="1" w:uiPriority="39" w:unhideWhenUsed="1"/>
+    <w:lsdException w:name="toc 4" w:semiHidden="1" w:uiPriority="39" w:unhideWhenUsed="1"/>
+    <w:lsdException w:name="toc 5" w:semiHidden="1" w:uiPriority="39" w:unhideWhenUsed="1"/>
+    <w:lsdException w:name="toc 6" w:semiHidden="1" w:uiPriority="39" w:unhideWhenUsed="1"/>
+    <w:lsdException w:name="toc 7" w:semiHidden="1" w:uiPriority="39" w:unhideWhenUsed="1"/>
+    <w:lsdException w:name="toc 8" w:semiHidden="1" w:uiPriority="39" w:unhideWhenUsed="1"/>
+    <w:lsdException w:name="toc 9" w:semiHidden="1" w:uiPriority="39" w:unhideWhenUsed="1"/>
     <w:lsdException w:name="Normal Indent" w:semiHidden="1" w:unhideWhenUsed="1"/>
     <w:lsdException w:name="footnote text" w:semiHidden="1" w:unhideWhenUsed="1"/>
     <w:lsdException w:name="annotation text" w:semiHidden="1" w:unhideWhenUsed="1"/>
-    <w:lsdException w:name="header" w:uiPriority="0" w:semiHidden="1" w:unhideWhenUsed="1"/>
-    <w:lsdException w:name="footer" w:uiPriority="0" w:semiHidden="1" w:unhideWhenUsed="1"/>
+    <w:lsdException w:name="header" w:semiHidden="1" w:uiPriority="0" w:unhideWhenUsed="1"/>
+    <w:lsdException w:name="footer" w:semiHidden="1" w:uiPriority="0" w:unhideWhenUsed="1"/>
     <w:lsdException w:name="index heading" w:semiHidden="1" w:unhideWhenUsed="1"/>
-    <w:lsdException w:name="caption" w:uiPriority="35" w:semiHidden="1" w:unhideWhenUsed="1" w:qFormat="1"/>
+    <w:lsdException w:name="caption" w:semiHidden="1" w:uiPriority="35" w:unhideWhenUsed="1" w:qFormat="1"/>
     <w:lsdException w:name="table of figures" w:semiHidden="1" w:unhideWhenUsed="1"/>
     <w:lsdException w:name="envelope address" w:semiHidden="1" w:unhideWhenUsed="1"/>
     <w:lsdException w:name="envelope return" w:semiHidden="1" w:unhideWhenUsed="1"/>
@@ -1842,7 +1509,7 @@
     <w:lsdException w:name="Title" w:uiPriority="10" w:qFormat="1"/>
     <w:lsdException w:name="Closing" w:semiHidden="1" w:unhideWhenUsed="1"/>
     <w:lsdException w:name="Signature" w:semiHidden="1" w:unhideWhenUsed="1"/>
-    <w:lsdException w:name="Default Paragraph Font" w:uiPriority="1" w:semiHidden="1" w:unhideWhenUsed="1"/>
+    <w:lsdException w:name="Default Paragraph Font" w:semiHidden="1" w:uiPriority="1" w:unhideWhenUsed="1"/>
     <w:lsdException w:name="Body Text" w:semiHidden="1" w:unhideWhenUsed="1"/>
     <w:lsdException w:name="Body Text Indent" w:semiHidden="1" w:unhideWhenUsed="1"/>
     <w:lsdException w:name="List Continue" w:semiHidden="1" w:unhideWhenUsed="1"/>
@@ -2042,8 +1709,8 @@
     <w:lsdException w:name="Subtle Reference" w:uiPriority="31" w:qFormat="1"/>
     <w:lsdException w:name="Intense Reference" w:uiPriority="32" w:qFormat="1"/>
     <w:lsdException w:name="Book Title" w:uiPriority="33" w:qFormat="1"/>
-    <w:lsdException w:name="Bibliography" w:uiPriority="37" w:semiHidden="1" w:unhideWhenUsed="1"/>
-    <w:lsdException w:name="TOC Heading" w:uiPriority="39" w:semiHidden="1" w:unhideWhenUsed="1" w:qFormat="1"/>
+    <w:lsdException w:name="Bibliography" w:semiHidden="1" w:uiPriority="37" w:unhideWhenUsed="1"/>
+    <w:lsdException w:name="TOC Heading" w:semiHidden="1" w:uiPriority="39" w:unhideWhenUsed="1" w:qFormat="1"/>
     <w:lsdException w:name="Grid Table 4" w:uiPriority="49"/>
     <w:lsdException w:name="Grid Table 5 Dark" w:uiPriority="50"/>
     <w:lsdException w:name="Grid Table 6 Colorful" w:uiPriority="51"/>
@@ -2139,113 +1806,126 @@
     <w:lsdException w:name="List Table 5 Dark Accent 6" w:uiPriority="50"/>
     <w:lsdException w:name="List Table 6 Colorful Accent 6" w:uiPriority="51"/>
     <w:lsdException w:name="List Table 7 Colorful Accent 6" w:uiPriority="52"/>
+    <w:lsdException w:name="Mention" w:semiHidden="1" w:unhideWhenUsed="1"/>
+    <w:lsdException w:name="Smart Hyperlink" w:semiHidden="1" w:unhideWhenUsed="1"/>
+    <w:lsdException w:name="Hashtag" w:semiHidden="1" w:unhideWhenUsed="1"/>
+    <w:lsdException w:name="Unresolved Mention" w:semiHidden="1" w:unhideWhenUsed="1"/>
+    <w:lsdException w:name="Smart Link" w:semiHidden="1" w:unhideWhenUsed="1"/>
   </w:latentStyles>
-  <w:style w:type="paragraph" w:styleId="Normal" w:default="1">
+  <w:style w:type="paragraph" w:default="1" w:styleId="Standard">
     <w:name w:val="Normal"/>
     <w:qFormat/>
-    <w:rsid w:val="008a6681"/>
-    <w:pPr>
-      <w:widowControl/>
-      <w:suppressAutoHyphens w:val="true"/>
-      <w:bidi w:val="0"/>
-      <w:spacing w:before="0" w:after="0"/>
-      <w:jc w:val="left"/>
-    </w:pPr>
+    <w:rsid w:val="008A6681"/>
     <w:rPr>
-      <w:rFonts w:ascii="Arial" w:hAnsi="Arial" w:eastAsia="Times New Roman" w:cs="Times New Roman"/>
+      <w:rFonts w:ascii="Arial" w:eastAsia="Times New Roman" w:hAnsi="Arial" w:cs="Times New Roman"/>
       <w:color w:val="00000A"/>
       <w:spacing w:val="8"/>
-      <w:kern w:val="0"/>
-      <w:sz w:val="20"/>
       <w:szCs w:val="20"/>
-      <w:lang w:val="de-CH" w:eastAsia="de-CH" w:bidi="ar-SA"/>
+      <w:lang w:eastAsia="de-CH"/>
     </w:rPr>
   </w:style>
-  <w:style w:type="character" w:styleId="DefaultParagraphFont" w:default="1">
+  <w:style w:type="character" w:default="1" w:styleId="Absatz-Standardschriftart">
     <w:name w:val="Default Paragraph Font"/>
     <w:uiPriority w:val="1"/>
     <w:semiHidden/>
     <w:unhideWhenUsed/>
-    <w:qFormat/>
-    <w:rPr/>
   </w:style>
-  <w:style w:type="character" w:styleId="KopfzeileZchn" w:customStyle="1">
+  <w:style w:type="table" w:default="1" w:styleId="NormaleTabelle">
+    <w:name w:val="Normal Table"/>
+    <w:uiPriority w:val="99"/>
+    <w:semiHidden/>
+    <w:unhideWhenUsed/>
+    <w:tblPr>
+      <w:tblInd w:w="0" w:type="dxa"/>
+      <w:tblCellMar>
+        <w:top w:w="0" w:type="dxa"/>
+        <w:left w:w="108" w:type="dxa"/>
+        <w:bottom w:w="0" w:type="dxa"/>
+        <w:right w:w="108" w:type="dxa"/>
+      </w:tblCellMar>
+    </w:tblPr>
+  </w:style>
+  <w:style w:type="numbering" w:default="1" w:styleId="KeineListe">
+    <w:name w:val="No List"/>
+    <w:uiPriority w:val="99"/>
+    <w:semiHidden/>
+    <w:unhideWhenUsed/>
+  </w:style>
+  <w:style w:type="character" w:customStyle="1" w:styleId="KopfzeileZchn">
     <w:name w:val="Kopfzeile Zchn"/>
-    <w:basedOn w:val="DefaultParagraphFont"/>
+    <w:basedOn w:val="Absatz-Standardschriftart"/>
     <w:link w:val="Kopfzeile1"/>
     <w:qFormat/>
-    <w:rsid w:val="008a6681"/>
+    <w:rsid w:val="008A6681"/>
     <w:rPr>
-      <w:rFonts w:ascii="Arial" w:hAnsi="Arial" w:eastAsia="Times New Roman" w:cs="Times New Roman"/>
+      <w:rFonts w:ascii="Arial" w:eastAsia="Times New Roman" w:hAnsi="Arial" w:cs="Times New Roman"/>
       <w:spacing w:val="8"/>
       <w:sz w:val="20"/>
       <w:szCs w:val="20"/>
       <w:lang w:eastAsia="de-CH"/>
     </w:rPr>
   </w:style>
-  <w:style w:type="character" w:styleId="FuzeileZchn" w:customStyle="1">
+  <w:style w:type="character" w:customStyle="1" w:styleId="FuzeileZchn">
     <w:name w:val="Fußzeile Zchn"/>
-    <w:basedOn w:val="DefaultParagraphFont"/>
+    <w:basedOn w:val="Absatz-Standardschriftart"/>
     <w:link w:val="Fuzeile1"/>
     <w:qFormat/>
-    <w:rsid w:val="008a6681"/>
+    <w:rsid w:val="008A6681"/>
     <w:rPr>
-      <w:rFonts w:ascii="Arial" w:hAnsi="Arial" w:eastAsia="Times New Roman" w:cs="Times New Roman"/>
+      <w:rFonts w:ascii="Arial" w:eastAsia="Times New Roman" w:hAnsi="Arial" w:cs="Times New Roman"/>
       <w:spacing w:val="6"/>
       <w:sz w:val="18"/>
       <w:szCs w:val="20"/>
       <w:lang w:eastAsia="de-CH"/>
     </w:rPr>
   </w:style>
-  <w:style w:type="character" w:styleId="Berschrift1Zchn" w:customStyle="1">
+  <w:style w:type="character" w:customStyle="1" w:styleId="berschrift1Zchn">
     <w:name w:val="Überschrift 1 Zchn"/>
-    <w:basedOn w:val="DefaultParagraphFont"/>
+    <w:basedOn w:val="Absatz-Standardschriftart"/>
     <w:uiPriority w:val="9"/>
     <w:qFormat/>
-    <w:rsid w:val="008a6681"/>
+    <w:rsid w:val="008A6681"/>
     <w:rPr>
-      <w:rFonts w:ascii="Cambria" w:hAnsi="Cambria" w:eastAsia="ＭＳ ゴシック" w:cs="" w:asciiTheme="majorHAnsi" w:cstheme="majorBidi" w:eastAsiaTheme="majorEastAsia" w:hAnsiTheme="majorHAnsi"/>
-      <w:color w:val="365F91" w:themeColor="accent1" w:themeShade="bf"/>
+      <w:rFonts w:asciiTheme="majorHAnsi" w:eastAsiaTheme="majorEastAsia" w:hAnsiTheme="majorHAnsi" w:cstheme="majorBidi"/>
+      <w:color w:val="365F91" w:themeColor="accent1" w:themeShade="BF"/>
       <w:spacing w:val="8"/>
       <w:sz w:val="32"/>
       <w:szCs w:val="32"/>
       <w:lang w:eastAsia="de-CH"/>
     </w:rPr>
   </w:style>
-  <w:style w:type="paragraph" w:styleId="Heading" w:customStyle="1">
+  <w:style w:type="paragraph" w:customStyle="1" w:styleId="Heading">
     <w:name w:val="Heading"/>
-    <w:basedOn w:val="Normal"/>
-    <w:next w:val="TextBody"/>
+    <w:basedOn w:val="Standard"/>
+    <w:next w:val="Textkrper"/>
     <w:qFormat/>
     <w:pPr>
-      <w:keepNext w:val="true"/>
+      <w:keepNext/>
       <w:spacing w:before="240" w:after="120"/>
     </w:pPr>
     <w:rPr>
-      <w:rFonts w:ascii="Liberation Sans" w:hAnsi="Liberation Sans" w:eastAsia="Noto Sans CJK SC Regular" w:cs="FreeSans"/>
+      <w:rFonts w:ascii="Liberation Sans" w:eastAsia="Noto Sans CJK SC Regular" w:hAnsi="Liberation Sans" w:cs="FreeSans"/>
       <w:sz w:val="28"/>
       <w:szCs w:val="28"/>
     </w:rPr>
   </w:style>
-  <w:style w:type="paragraph" w:styleId="TextBody">
+  <w:style w:type="paragraph" w:styleId="Textkrper">
     <w:name w:val="Body Text"/>
-    <w:basedOn w:val="Normal"/>
+    <w:basedOn w:val="Standard"/>
     <w:pPr>
-      <w:spacing w:lineRule="auto" w:line="288" w:before="0" w:after="140"/>
+      <w:spacing w:after="140" w:line="288" w:lineRule="auto"/>
     </w:pPr>
-    <w:rPr/>
   </w:style>
-  <w:style w:type="paragraph" w:styleId="List">
+  <w:style w:type="paragraph" w:styleId="Liste">
     <w:name w:val="List"/>
-    <w:basedOn w:val="TextBody"/>
-    <w:pPr/>
+    <w:basedOn w:val="Textkrper"/>
     <w:rPr>
       <w:rFonts w:cs="FreeSans"/>
     </w:rPr>
   </w:style>
-  <w:style w:type="paragraph" w:styleId="Caption">
-    <w:name w:val="Caption"/>
-    <w:basedOn w:val="Normal"/>
+  <w:style w:type="paragraph" w:styleId="Beschriftung">
+    <w:name w:val="caption"/>
+    <w:basedOn w:val="Standard"/>
     <w:qFormat/>
     <w:pPr>
       <w:suppressLineNumbers/>
@@ -2259,9 +1939,9 @@
       <w:szCs w:val="24"/>
     </w:rPr>
   </w:style>
-  <w:style w:type="paragraph" w:styleId="Index" w:customStyle="1">
+  <w:style w:type="paragraph" w:customStyle="1" w:styleId="Index">
     <w:name w:val="Index"/>
-    <w:basedOn w:val="Normal"/>
+    <w:basedOn w:val="Standard"/>
     <w:qFormat/>
     <w:pPr>
       <w:suppressLineNumbers/>
@@ -2270,28 +1950,28 @@
       <w:rFonts w:cs="FreeSans"/>
     </w:rPr>
   </w:style>
-  <w:style w:type="paragraph" w:styleId="Berschrift11" w:customStyle="1">
+  <w:style w:type="paragraph" w:customStyle="1" w:styleId="berschrift11">
     <w:name w:val="Überschrift 11"/>
-    <w:basedOn w:val="Normal"/>
+    <w:basedOn w:val="Standard"/>
     <w:uiPriority w:val="9"/>
     <w:qFormat/>
-    <w:rsid w:val="008a6681"/>
+    <w:rsid w:val="008A6681"/>
     <w:pPr>
-      <w:keepNext w:val="true"/>
+      <w:keepNext/>
       <w:keepLines/>
-      <w:spacing w:before="240" w:after="0"/>
+      <w:spacing w:before="240"/>
       <w:outlineLvl w:val="0"/>
     </w:pPr>
     <w:rPr>
-      <w:rFonts w:ascii="Cambria" w:hAnsi="Cambria" w:eastAsia="ＭＳ ゴシック" w:cs="" w:asciiTheme="majorHAnsi" w:cstheme="majorBidi" w:eastAsiaTheme="majorEastAsia" w:hAnsiTheme="majorHAnsi"/>
-      <w:color w:val="365F91" w:themeColor="accent1" w:themeShade="bf"/>
+      <w:rFonts w:asciiTheme="majorHAnsi" w:eastAsiaTheme="majorEastAsia" w:hAnsiTheme="majorHAnsi" w:cstheme="majorBidi"/>
+      <w:color w:val="365F91" w:themeColor="accent1" w:themeShade="BF"/>
       <w:sz w:val="32"/>
       <w:szCs w:val="32"/>
     </w:rPr>
   </w:style>
-  <w:style w:type="paragraph" w:styleId="Beschriftung1" w:customStyle="1">
+  <w:style w:type="paragraph" w:customStyle="1" w:styleId="Beschriftung1">
     <w:name w:val="Beschriftung1"/>
-    <w:basedOn w:val="Normal"/>
+    <w:basedOn w:val="Standard"/>
     <w:qFormat/>
     <w:pPr>
       <w:suppressLineNumbers/>
@@ -2305,87 +1985,83 @@
       <w:szCs w:val="24"/>
     </w:rPr>
   </w:style>
-  <w:style w:type="paragraph" w:styleId="Kopfzeile1" w:customStyle="1">
+  <w:style w:type="paragraph" w:customStyle="1" w:styleId="Kopfzeile1">
     <w:name w:val="Kopfzeile1"/>
-    <w:basedOn w:val="Normal"/>
+    <w:basedOn w:val="Standard"/>
     <w:link w:val="KopfzeileZchn"/>
     <w:qFormat/>
-    <w:rsid w:val="008a6681"/>
+    <w:rsid w:val="008A6681"/>
     <w:pPr>
       <w:tabs>
-        <w:tab w:val="clear" w:pos="708"/>
-        <w:tab w:val="center" w:pos="4536" w:leader="none"/>
-        <w:tab w:val="right" w:pos="9072" w:leader="none"/>
+        <w:tab w:val="center" w:pos="4536"/>
+        <w:tab w:val="right" w:pos="9072"/>
       </w:tabs>
     </w:pPr>
-    <w:rPr/>
   </w:style>
-  <w:style w:type="paragraph" w:styleId="Fuzeile1" w:customStyle="1">
+  <w:style w:type="paragraph" w:customStyle="1" w:styleId="Fuzeile1">
     <w:name w:val="Fußzeile1"/>
-    <w:basedOn w:val="Normal"/>
+    <w:basedOn w:val="Standard"/>
     <w:link w:val="FuzeileZchn"/>
     <w:qFormat/>
-    <w:rsid w:val="008a6681"/>
+    <w:rsid w:val="008A6681"/>
     <w:pPr>
       <w:tabs>
-        <w:tab w:val="clear" w:pos="708"/>
-        <w:tab w:val="center" w:pos="4536" w:leader="none"/>
-        <w:tab w:val="right" w:pos="9072" w:leader="none"/>
+        <w:tab w:val="center" w:pos="4536"/>
+        <w:tab w:val="right" w:pos="9072"/>
       </w:tabs>
-      <w:spacing w:lineRule="atLeast" w:line="240"/>
+      <w:spacing w:line="240" w:lineRule="atLeast"/>
     </w:pPr>
     <w:rPr>
       <w:spacing w:val="6"/>
       <w:sz w:val="18"/>
     </w:rPr>
   </w:style>
-  <w:style w:type="paragraph" w:styleId="Absender" w:customStyle="1">
+  <w:style w:type="paragraph" w:customStyle="1" w:styleId="Absender">
     <w:name w:val="Absender"/>
-    <w:basedOn w:val="Normal"/>
+    <w:basedOn w:val="Standard"/>
     <w:qFormat/>
-    <w:rsid w:val="008a6681"/>
+    <w:rsid w:val="008A6681"/>
     <w:pPr>
-      <w:spacing w:lineRule="atLeast" w:line="240"/>
+      <w:spacing w:line="240" w:lineRule="atLeast"/>
     </w:pPr>
     <w:rPr>
       <w:spacing w:val="6"/>
       <w:sz w:val="18"/>
     </w:rPr>
   </w:style>
-  <w:style w:type="paragraph" w:styleId="Text" w:customStyle="1">
+  <w:style w:type="paragraph" w:customStyle="1" w:styleId="Text">
     <w:name w:val="Text"/>
-    <w:basedOn w:val="Normal"/>
+    <w:basedOn w:val="Standard"/>
     <w:qFormat/>
-    <w:rsid w:val="008a6681"/>
+    <w:rsid w:val="008A6681"/>
     <w:pPr>
-      <w:spacing w:lineRule="atLeast" w:line="280"/>
+      <w:spacing w:line="280" w:lineRule="atLeast"/>
     </w:pPr>
-    <w:rPr/>
   </w:style>
-  <w:style w:type="paragraph" w:styleId="Direktion" w:customStyle="1">
+  <w:style w:type="paragraph" w:customStyle="1" w:styleId="Direktion">
     <w:name w:val="Direktion"/>
-    <w:basedOn w:val="Normal"/>
+    <w:basedOn w:val="Standard"/>
     <w:qFormat/>
-    <w:rsid w:val="008a6681"/>
+    <w:rsid w:val="008A6681"/>
     <w:pPr>
-      <w:spacing w:lineRule="atLeast" w:line="240"/>
+      <w:spacing w:line="240" w:lineRule="atLeast"/>
     </w:pPr>
     <w:rPr>
       <w:spacing w:val="6"/>
       <w:sz w:val="18"/>
     </w:rPr>
   </w:style>
-  <w:style w:type="paragraph" w:styleId="StadtBern" w:customStyle="1">
+  <w:style w:type="paragraph" w:customStyle="1" w:styleId="StadtBern">
     <w:name w:val="Stadt Bern"/>
-    <w:basedOn w:val="Berschrift11"/>
+    <w:basedOn w:val="berschrift11"/>
     <w:qFormat/>
-    <w:rsid w:val="008a6681"/>
+    <w:rsid w:val="008A6681"/>
     <w:pPr>
-      <w:keepLines w:val="false"/>
-      <w:spacing w:lineRule="exact" w:line="240" w:before="360" w:after="0"/>
+      <w:keepLines w:val="0"/>
+      <w:spacing w:before="360" w:line="240" w:lineRule="exact"/>
     </w:pPr>
     <w:rPr>
-      <w:rFonts w:ascii="Arial" w:hAnsi="Arial" w:eastAsia="Times New Roman" w:cs="Times New Roman"/>
+      <w:rFonts w:ascii="Arial" w:eastAsia="Times New Roman" w:hAnsi="Arial" w:cs="Times New Roman"/>
       <w:b/>
       <w:color w:val="00000A"/>
       <w:spacing w:val="6"/>
@@ -2393,72 +2069,39 @@
       <w:szCs w:val="20"/>
     </w:rPr>
   </w:style>
-  <w:style w:type="paragraph" w:styleId="TableContents" w:customStyle="1">
+  <w:style w:type="paragraph" w:customStyle="1" w:styleId="TableContents">
     <w:name w:val="Table Contents"/>
-    <w:basedOn w:val="Normal"/>
+    <w:basedOn w:val="Standard"/>
     <w:qFormat/>
-    <w:pPr/>
-    <w:rPr/>
   </w:style>
-  <w:style w:type="paragraph" w:styleId="TableHeading" w:customStyle="1">
+  <w:style w:type="paragraph" w:customStyle="1" w:styleId="TableHeading">
     <w:name w:val="Table Heading"/>
     <w:basedOn w:val="TableContents"/>
     <w:qFormat/>
-    <w:pPr/>
-    <w:rPr/>
   </w:style>
-  <w:style w:type="paragraph" w:styleId="ListParagraph">
+  <w:style w:type="paragraph" w:styleId="Listenabsatz">
     <w:name w:val="List Paragraph"/>
-    <w:basedOn w:val="Normal"/>
+    <w:basedOn w:val="Standard"/>
     <w:uiPriority w:val="34"/>
     <w:qFormat/>
     <w:rsid w:val="00111337"/>
     <w:pPr>
-      <w:spacing w:before="0" w:after="0"/>
-      <w:ind w:left="720" w:hanging="0"/>
+      <w:ind w:left="720"/>
       <w:contextualSpacing/>
     </w:pPr>
-    <w:rPr/>
   </w:style>
-  <w:style w:type="paragraph" w:styleId="HeaderandFooter">
+  <w:style w:type="paragraph" w:customStyle="1" w:styleId="HeaderandFooter">
     <w:name w:val="Header and Footer"/>
-    <w:basedOn w:val="Normal"/>
-    <w:qFormat/>
-    <w:pPr/>
-    <w:rPr/>
-  </w:style>
-  <w:style w:type="paragraph" w:styleId="Header">
-    <w:name w:val="Header"/>
-    <w:basedOn w:val="HeaderandFooter"/>
-    <w:pPr/>
-    <w:rPr/>
-  </w:style>
-  <w:style w:type="paragraph" w:styleId="Footer">
-    <w:name w:val="Footer"/>
-    <w:basedOn w:val="HeaderandFooter"/>
-    <w:pPr/>
-    <w:rPr/>
-  </w:style>
-  <w:style w:type="numbering" w:styleId="NoList" w:default="1">
-    <w:name w:val="No List"/>
-    <w:uiPriority w:val="99"/>
-    <w:semiHidden/>
-    <w:unhideWhenUsed/>
+    <w:basedOn w:val="Standard"/>
     <w:qFormat/>
   </w:style>
-  <w:style w:type="table" w:default="1" w:styleId="NormaleTabelle">
-    <w:name w:val="Normal Table"/>
-    <w:uiPriority w:val="99"/>
-    <w:semiHidden/>
-    <w:unhideWhenUsed/>
-    <w:tblPr>
-      <w:tblCellMar>
-        <w:top w:w="0" w:type="dxa"/>
-        <w:left w:w="108" w:type="dxa"/>
-        <w:bottom w:w="0" w:type="dxa"/>
-        <w:right w:w="108" w:type="dxa"/>
-      </w:tblCellMar>
-    </w:tblPr>
+  <w:style w:type="paragraph" w:styleId="Kopfzeile">
+    <w:name w:val="header"/>
+    <w:basedOn w:val="HeaderandFooter"/>
+  </w:style>
+  <w:style w:type="paragraph" w:styleId="Fuzeile">
+    <w:name w:val="footer"/>
+    <w:basedOn w:val="HeaderandFooter"/>
   </w:style>
 </w:styles>
 </file>
@@ -2758,49 +2401,18 @@
 </file>
 
 <file path=customXml/item2.xml><?xml version="1.0" encoding="utf-8"?>
-<?mso-contentType ?>
-<spe:Receivers xmlns:spe="http://schemas.microsoft.com/sharepoint/events">
-  <Receiver>
-    <Name>Document ID Generator</Name>
-    <Synchronization>Synchronous</Synchronization>
-    <Type>10001</Type>
-    <SequenceNumber>1000</SequenceNumber>
-    <Assembly>Microsoft.Office.DocumentManagement, Version=14.0.0.0, Culture=neutral, PublicKeyToken=71e9bce111e9429c</Assembly>
-    <Class>Microsoft.Office.DocumentManagement.Internal.DocIdHandler</Class>
-    <Data/>
-    <Filter/>
-  </Receiver>
-  <Receiver>
-    <Name>Document ID Generator</Name>
-    <Synchronization>Synchronous</Synchronization>
-    <Type>10002</Type>
-    <SequenceNumber>1001</SequenceNumber>
-    <Assembly>Microsoft.Office.DocumentManagement, Version=14.0.0.0, Culture=neutral, PublicKeyToken=71e9bce111e9429c</Assembly>
-    <Class>Microsoft.Office.DocumentManagement.Internal.DocIdHandler</Class>
-    <Data/>
-    <Filter/>
-  </Receiver>
-  <Receiver>
-    <Name>Document ID Generator</Name>
-    <Synchronization>Synchronous</Synchronization>
-    <Type>10004</Type>
-    <SequenceNumber>1002</SequenceNumber>
-    <Assembly>Microsoft.Office.DocumentManagement, Version=14.0.0.0, Culture=neutral, PublicKeyToken=71e9bce111e9429c</Assembly>
-    <Class>Microsoft.Office.DocumentManagement.Internal.DocIdHandler</Class>
-    <Data/>
-    <Filter/>
-  </Receiver>
-  <Receiver>
-    <Name>Document ID Generator</Name>
-    <Synchronization>Synchronous</Synchronization>
-    <Type>10006</Type>
-    <SequenceNumber>1003</SequenceNumber>
-    <Assembly>Microsoft.Office.DocumentManagement, Version=14.0.0.0, Culture=neutral, PublicKeyToken=71e9bce111e9429c</Assembly>
-    <Class>Microsoft.Office.DocumentManagement.Internal.DocIdHandler</Class>
-    <Data/>
-    <Filter/>
-  </Receiver>
-</spe:Receivers>
+<p:properties xmlns:p="http://schemas.microsoft.com/office/2006/metadata/properties" xmlns:xsi="http://www.w3.org/2001/XMLSchema-instance" xmlns:pc="http://schemas.microsoft.com/office/infopath/2007/PartnerControls">
+  <documentManagement>
+    <Konzept xmlns="9b8c0751-faa8-4231-a5ac-6bf79da18d38">5.3.10 Vorlagen</Konzept>
+    <Detail xmlns="9b8c0751-faa8-4231-a5ac-6bf79da18d38" xsi:nil="true"/>
+    <Kategorie xmlns="9b8c0751-faa8-4231-a5ac-6bf79da18d38">5.3 Phasenabschluss Konzept</Kategorie>
+    <_dlc_DocId xmlns="54ee83ef-352e-45b0-bb8b-979b683ba7bf">ZSZN6JXWY7WE-3092-165</_dlc_DocId>
+    <_dlc_DocIdUrl xmlns="54ee83ef-352e-45b0-bb8b-979b683ba7bf">
+      <Url>https://www.collaboration.apps.be.ch/e-bau/_layouts/DocIdRedir.aspx?ID=ZSZN6JXWY7WE-3092-165</Url>
+      <Description>ZSZN6JXWY7WE-3092-165</Description>
+    </_dlc_DocIdUrl>
+  </documentManagement>
+</p:properties>
 </file>
 
 <file path=customXml/item3.xml><?xml version="1.0" encoding="utf-8"?>
@@ -2991,18 +2603,49 @@
 </file>
 
 <file path=customXml/item4.xml><?xml version="1.0" encoding="utf-8"?>
-<p:properties xmlns:p="http://schemas.microsoft.com/office/2006/metadata/properties" xmlns:xsi="http://www.w3.org/2001/XMLSchema-instance" xmlns:pc="http://schemas.microsoft.com/office/infopath/2007/PartnerControls">
-  <documentManagement>
-    <Konzept xmlns="9b8c0751-faa8-4231-a5ac-6bf79da18d38">5.3.10 Vorlagen</Konzept>
-    <Detail xmlns="9b8c0751-faa8-4231-a5ac-6bf79da18d38" xsi:nil="true"/>
-    <Kategorie xmlns="9b8c0751-faa8-4231-a5ac-6bf79da18d38">5.3 Phasenabschluss Konzept</Kategorie>
-    <_dlc_DocId xmlns="54ee83ef-352e-45b0-bb8b-979b683ba7bf">ZSZN6JXWY7WE-3092-165</_dlc_DocId>
-    <_dlc_DocIdUrl xmlns="54ee83ef-352e-45b0-bb8b-979b683ba7bf">
-      <Url>https://www.collaboration.apps.be.ch/e-bau/_layouts/DocIdRedir.aspx?ID=ZSZN6JXWY7WE-3092-165</Url>
-      <Description>ZSZN6JXWY7WE-3092-165</Description>
-    </_dlc_DocIdUrl>
-  </documentManagement>
-</p:properties>
+<?mso-contentType ?>
+<spe:Receivers xmlns:spe="http://schemas.microsoft.com/sharepoint/events">
+  <Receiver>
+    <Name>Document ID Generator</Name>
+    <Synchronization>Synchronous</Synchronization>
+    <Type>10001</Type>
+    <SequenceNumber>1000</SequenceNumber>
+    <Assembly>Microsoft.Office.DocumentManagement, Version=14.0.0.0, Culture=neutral, PublicKeyToken=71e9bce111e9429c</Assembly>
+    <Class>Microsoft.Office.DocumentManagement.Internal.DocIdHandler</Class>
+    <Data/>
+    <Filter/>
+  </Receiver>
+  <Receiver>
+    <Name>Document ID Generator</Name>
+    <Synchronization>Synchronous</Synchronization>
+    <Type>10002</Type>
+    <SequenceNumber>1001</SequenceNumber>
+    <Assembly>Microsoft.Office.DocumentManagement, Version=14.0.0.0, Culture=neutral, PublicKeyToken=71e9bce111e9429c</Assembly>
+    <Class>Microsoft.Office.DocumentManagement.Internal.DocIdHandler</Class>
+    <Data/>
+    <Filter/>
+  </Receiver>
+  <Receiver>
+    <Name>Document ID Generator</Name>
+    <Synchronization>Synchronous</Synchronization>
+    <Type>10004</Type>
+    <SequenceNumber>1002</SequenceNumber>
+    <Assembly>Microsoft.Office.DocumentManagement, Version=14.0.0.0, Culture=neutral, PublicKeyToken=71e9bce111e9429c</Assembly>
+    <Class>Microsoft.Office.DocumentManagement.Internal.DocIdHandler</Class>
+    <Data/>
+    <Filter/>
+  </Receiver>
+  <Receiver>
+    <Name>Document ID Generator</Name>
+    <Synchronization>Synchronous</Synchronization>
+    <Type>10006</Type>
+    <SequenceNumber>1003</SequenceNumber>
+    <Assembly>Microsoft.Office.DocumentManagement, Version=14.0.0.0, Culture=neutral, PublicKeyToken=71e9bce111e9429c</Assembly>
+    <Class>Microsoft.Office.DocumentManagement.Internal.DocIdHandler</Class>
+    <Data/>
+    <Filter/>
+  </Receiver>
+</spe:Receivers>
 </file>
 
 <file path=customXml/itemProps1.xml><?xml version="1.0" encoding="utf-8"?>
@@ -3014,9 +2657,12 @@
 </file>
 
 <file path=customXml/itemProps2.xml><?xml version="1.0" encoding="utf-8"?>
-<ds:datastoreItem xmlns:ds="http://schemas.openxmlformats.org/officeDocument/2006/customXml" ds:itemID="{ACB1CF03-321E-4951-84A9-64CE477BB5B7}">
+<ds:datastoreItem xmlns:ds="http://schemas.openxmlformats.org/officeDocument/2006/customXml" ds:itemID="{C536CBA0-5527-4ADE-BA50-D20B24EF8D53}">
   <ds:schemaRefs>
-    <ds:schemaRef ds:uri="http://schemas.microsoft.com/sharepoint/events"/>
+    <ds:schemaRef ds:uri="http://schemas.microsoft.com/office/2006/metadata/properties"/>
+    <ds:schemaRef ds:uri="http://schemas.microsoft.com/office/infopath/2007/PartnerControls"/>
+    <ds:schemaRef ds:uri="9b8c0751-faa8-4231-a5ac-6bf79da18d38"/>
+    <ds:schemaRef ds:uri="54ee83ef-352e-45b0-bb8b-979b683ba7bf"/>
   </ds:schemaRefs>
 </ds:datastoreItem>
 </file>
@@ -3041,12 +2687,9 @@
 </file>
 
 <file path=customXml/itemProps4.xml><?xml version="1.0" encoding="utf-8"?>
-<ds:datastoreItem xmlns:ds="http://schemas.openxmlformats.org/officeDocument/2006/customXml" ds:itemID="{C536CBA0-5527-4ADE-BA50-D20B24EF8D53}">
+<ds:datastoreItem xmlns:ds="http://schemas.openxmlformats.org/officeDocument/2006/customXml" ds:itemID="{ACB1CF03-321E-4951-84A9-64CE477BB5B7}">
   <ds:schemaRefs>
-    <ds:schemaRef ds:uri="http://schemas.microsoft.com/office/2006/metadata/properties"/>
-    <ds:schemaRef ds:uri="http://schemas.microsoft.com/office/infopath/2007/PartnerControls"/>
-    <ds:schemaRef ds:uri="9b8c0751-faa8-4231-a5ac-6bf79da18d38"/>
-    <ds:schemaRef ds:uri="54ee83ef-352e-45b0-bb8b-979b683ba7bf"/>
+    <ds:schemaRef ds:uri="http://schemas.microsoft.com/sharepoint/events"/>
   </ds:schemaRefs>
 </ds:datastoreItem>
 </file>
</xml_diff>